<commit_message>
feat: harden authorization and payment idempotency
</commit_message>
<xml_diff>
--- a/System_Design_and_Engineering_Portfolio.docx
+++ b/System_Design_and_Engineering_Portfolio.docx
@@ -184,7 +184,7 @@
                 <w:color w:val="18324B"/>
                 <w:sz w:val="36"/>
               </w:rPr>
-              <w:t>104</w:t>
+              <w:t>113</w:t>
             </w:r>
           </w:p>
         </w:tc>
@@ -204,7 +204,7 @@
                 <w:color w:val="18324B"/>
                 <w:sz w:val="36"/>
               </w:rPr>
-              <w:t>81.48%</w:t>
+              <w:t>87.24%</w:t>
             </w:r>
           </w:p>
         </w:tc>
@@ -224,7 +224,7 @@
                 <w:color w:val="18324B"/>
                 <w:sz w:val="36"/>
               </w:rPr>
-              <w:t>68.29%</w:t>
+              <w:t>71.43%</w:t>
             </w:r>
           </w:p>
         </w:tc>
@@ -244,7 +244,7 @@
                 <w:color w:val="18324B"/>
                 <w:sz w:val="36"/>
               </w:rPr>
-              <w:t>8</w:t>
+              <w:t>9</w:t>
             </w:r>
           </w:p>
         </w:tc>
@@ -280,7 +280,7 @@
         <w:jc w:val="center"/>
       </w:pPr>
       <w:r>
-        <w:t>Verified baseline: 2026-08-05  |  Git HEAD ffbe94e</w:t>
+        <w:t>Verified baseline: 2026-08-05  |  HEAD 79971f8 + Phase 1 hardening</w:t>
       </w:r>
     </w:p>
     <w:p>
@@ -457,7 +457,21 @@
         <w:rPr>
           <w:rFonts w:ascii="Arial Unicode MS" w:hAnsi="Arial Unicode MS" w:eastAsia="Arial Unicode MS" w:cs="Arial Unicode MS"/>
         </w:rPr>
-        <w:t>Concurrent payments for one order are serialized by a pessimistic lock, a one-payment-per-order constraint, and a second idempotency lookup.</w:t>
+        <w:t>Payment and cancellation share one pessimistic order lock; payment replay also uses payment and key/path uniqueness constraints.</w:t>
+      </w:r>
+    </w:p>
+    <w:p>
+      <w:pPr>
+        <w:numPr>
+          <w:ilvl w:val="0"/>
+          <w:numId w:val="10"/>
+        </w:numPr>
+      </w:pPr>
+      <w:r>
+        <w:rPr>
+          <w:rFonts w:ascii="Arial Unicode MS" w:hAnsi="Arial Unicode MS" w:eastAsia="Arial Unicode MS" w:cs="Arial Unicode MS"/>
+        </w:rPr>
+        <w:t>SHA-256 request fingerprints reject same-key/different-method retries, while response status, payment reference, and expiry metadata are persisted.</w:t>
       </w:r>
     </w:p>
     <w:p>
@@ -513,7 +527,7 @@
         <w:rPr>
           <w:rFonts w:ascii="Arial Unicode MS" w:hAnsi="Arial Unicode MS" w:eastAsia="Arial Unicode MS" w:cs="Arial Unicode MS"/>
         </w:rPr>
-        <w:t>104 tests, a JaCoCo gate, a coverage regression baseline, CodeQL, and Dependabot provide automated quality evidence.</w:t>
+        <w:t>113 tests, a JaCoCo gate, a coverage regression baseline, CodeQL, and Dependabot provide automated quality evidence.</w:t>
       </w:r>
     </w:p>
     <w:p>
@@ -541,7 +555,7 @@
           <w:color w:val="18324B"/>
           <w:sz w:val="21"/>
         </w:rPr>
-        <w:t>The accurate positioning is a backend engineering portfolio with production thinking. It does not yet have the complete authorization boundary, HA topology, real payment integration, DLT operations, or verified cloud deployment required for a commercial production service.</w:t>
+        <w:t>The accurate positioning is a backend engineering portfolio with production thinking. The user-API authorization gap and core payment-idempotency constraints are closed; HA topology, real payment integration, DLT operations, and verified cloud delivery remain before commercial production use.</w:t>
       </w:r>
     </w:p>
     <w:p>
@@ -557,7 +571,7 @@
         <w:pStyle w:val="TableCaption"/>
       </w:pPr>
       <w:r>
-        <w:t>Table 1 | Isolated snapshot verification on 2026-08-05</w:t>
+        <w:t>Table 1 | Local working-tree verification on 2026-08-05</w:t>
       </w:r>
     </w:p>
     <w:tbl>
@@ -756,7 +770,7 @@
                 <w:color w:val="17212B"/>
                 <w:sz w:val="18"/>
               </w:rPr>
-              <w:t>104 passed / 0 failed / 0 errors / 0 skipped</w:t>
+              <w:t>113 passed / 0 failed / 0 errors / 0 skipped</w:t>
             </w:r>
           </w:p>
         </w:tc>
@@ -798,7 +812,7 @@
                 <w:color w:val="17212B"/>
                 <w:sz w:val="18"/>
               </w:rPr>
-              <w:t>23 (62 unit/component + 42 integration tests)</w:t>
+              <w:t>24 (64 unit/component + 49 integration tests)</w:t>
             </w:r>
           </w:p>
         </w:tc>
@@ -882,7 +896,7 @@
                 <w:color w:val="17212B"/>
                 <w:sz w:val="18"/>
               </w:rPr>
-              <w:t>81.48% / 68.29% / 80.87%</w:t>
+              <w:t>87.24% / 71.43% / 86.57%</w:t>
             </w:r>
           </w:p>
         </w:tc>
@@ -1008,7 +1022,7 @@
                 <w:color w:val="17212B"/>
                 <w:sz w:val="18"/>
               </w:rPr>
-              <w:t>43.776 seconds on the local verification environment</w:t>
+              <w:t>43.246 seconds on the local verification environment</w:t>
             </w:r>
           </w:p>
         </w:tc>
@@ -1024,7 +1038,7 @@
         <w:pStyle w:val="SmallNote"/>
       </w:pPr>
       <w:r>
-        <w:t>Verification ran in an isolated snapshot without overwriting the original repository's target artifacts. Mockito required an explicit Byte Buddy agent in the restricted JDK 25 environment; all 104 tests still executed with no skip or quarantine.</w:t>
+        <w:t>Verification ran in the local working tree against disposable Testcontainers infrastructure. Mockito required an explicit Byte Buddy agent in the restricted JDK 25 environment; all 113 tests still executed with no skip or quarantine.</w:t>
       </w:r>
     </w:p>
     <w:p>
@@ -1546,7 +1560,7 @@
                 <w:color w:val="17212B"/>
                 <w:sz w:val="18"/>
               </w:rPr>
-              <w:t>8</w:t>
+              <w:t>9</w:t>
             </w:r>
           </w:p>
         </w:tc>
@@ -1566,7 +1580,7 @@
                 <w:color w:val="17212B"/>
                 <w:sz w:val="18"/>
               </w:rPr>
-              <w:t>Schema v1 to v8</w:t>
+              <w:t>Schema v1 to v9</w:t>
             </w:r>
           </w:p>
         </w:tc>
@@ -1608,7 +1622,7 @@
                 <w:color w:val="17212B"/>
                 <w:sz w:val="18"/>
               </w:rPr>
-              <w:t>24 files</w:t>
+              <w:t>25 files</w:t>
             </w:r>
           </w:p>
         </w:tc>
@@ -1628,7 +1642,7 @@
                 <w:color w:val="17212B"/>
                 <w:sz w:val="18"/>
               </w:rPr>
-              <w:t>23 suites + shared Testcontainers base</w:t>
+              <w:t>24 suites + shared Testcontainers base</w:t>
             </w:r>
           </w:p>
         </w:tc>
@@ -1884,7 +1898,7 @@
         <w:rPr>
           <w:rFonts w:ascii="Arial Unicode MS" w:hAnsi="Arial Unicode MS" w:eastAsia="Arial Unicode MS" w:cs="Arial Unicode MS"/>
         </w:rPr>
-        <w:t>Cancellation accepts only PENDING, restores stock, and transitions the order to CANCELLED. /orders/slow adds a deliberate five-second delay for the optimistic-lock lab; a production service should replace the exposed slow endpoint with a test harness.</w:t>
+        <w:t>Cancellation accepts only PENDING, shares the payment pessimistic lock, restores stock, and transitions the order to CANCELLED. A scalar owner-ID authorization query avoids stale order entities before locking. /orders/slow remains a lab endpoint that should move into a test harness.</w:t>
       </w:r>
     </w:p>
     <w:p>
@@ -1911,7 +1925,7 @@
           <w:color w:val="17212B"/>
           <w:sz w:val="17"/>
         </w:rPr>
-        <w:t>idempotency lookup</w:t>
+        <w:t>key/path lookup + request fingerprint check</w:t>
         <w:br/>
         <w:t xml:space="preserve">  -&gt; SELECT order FOR UPDATE</w:t>
         <w:br/>
@@ -1919,7 +1933,7 @@
         <w:br/>
         <w:t xml:space="preserve">  -&gt; validate PENDING / no existing payment</w:t>
         <w:br/>
-        <w:t xml:space="preserve">  -&gt; payment + idempotency record + order PAID + PAYMENT_PAID outbox</w:t>
+        <w:t xml:space="preserve">  -&gt; payment + replay metadata + order PAID + PAYMENT_PAID outbox</w:t>
         <w:br/>
         <w:t xml:space="preserve">  -&gt; one PostgreSQL commit</w:t>
       </w:r>
@@ -1929,7 +1943,7 @@
         <w:rPr>
           <w:rFonts w:ascii="Arial Unicode MS" w:hAnsi="Arial Unicode MS" w:eastAsia="Arial Unicode MS" w:cs="Arial Unicode MS"/>
         </w:rPr>
-        <w:t>The primary database guarantees are the order pessimistic lock and payments.order_id UNIQUE. idempotency_records has only a non-unique (key, path) index. A generalized contract should add a unique constraint, request fingerprint, stored response, expiry, and cleanup.</w:t>
+        <w:t>PostgreSQL enforces payments.order_id UNIQUE and UNIQUE (idempotency_key, request_path). V9 adds a payment foreign key, SHA-256 request fingerprint, response status, payment response reference, and 24-hour expiry metadata. Remaining lifecycle work is scheduled cleanup, retention metrics, and an optional immutable response snapshot.</w:t>
       </w:r>
     </w:p>
     <w:p>
@@ -2820,6 +2834,20 @@
         <w:rPr>
           <w:rFonts w:ascii="Arial Unicode MS" w:hAnsi="Arial Unicode MS" w:eastAsia="Arial Unicode MS" w:cs="Arial Unicode MS"/>
         </w:rPr>
+        <w:t>Legacy user collection/create routes require ADMIN; user detail/update/delete require the owner or ADMIN.</w:t>
+      </w:r>
+    </w:p>
+    <w:p>
+      <w:pPr>
+        <w:numPr>
+          <w:ilvl w:val="0"/>
+          <w:numId w:val="10"/>
+        </w:numPr>
+      </w:pPr>
+      <w:r>
+        <w:rPr>
+          <w:rFonts w:ascii="Arial Unicode MS" w:hAnsi="Arial Unicode MS" w:eastAsia="Arial Unicode MS" w:cs="Arial Unicode MS"/>
+        </w:rPr>
         <w:t>Cart routes authenticated and require path user ownership or ADMIN.</w:t>
       </w:r>
     </w:p>
@@ -2872,7 +2900,7 @@
         <w:ind w:left="202" w:right="144"/>
         <w:shd w:val="clear" w:color="auto" w:fill="F4F6F9"/>
         <w:pBdr>
-          <w:left w:val="single" w:sz="16" w:space="10" w:color="9B1C1C"/>
+          <w:left w:val="single" w:sz="16" w:space="10" w:color="2E7D4F"/>
         </w:pBdr>
       </w:pPr>
       <w:r>
@@ -2882,7 +2910,7 @@
           <w:color w:val="18324B"/>
           <w:sz w:val="21"/>
         </w:rPr>
-        <w:t xml:space="preserve">P0 Security finding  </w:t>
+        <w:t xml:space="preserve">Authorization boundary closed  </w:t>
       </w:r>
       <w:r>
         <w:rPr>
@@ -2890,7 +2918,7 @@
           <w:color w:val="18324B"/>
           <w:sz w:val="21"/>
         </w:rPr>
-        <w:t>Legacy /api/users/** CRUD currently falls through to anyRequest().permitAll(), allowing unauthenticated reads, updates, and deletion of user rows. Remove it before deployment or enforce explicit admin and self-service policies with privilege-escalation tests.</w:t>
+        <w:t>Anonymous and cross-user legacy user CRUD are denied, collection/create require ADMIN, item operations require owner or ADMIN, and unmatched routes use denyAll. Four integration tests exercise anonymous, self-service, cross-user, normal-user collection, and admin flows.</w:t>
       </w:r>
     </w:p>
     <w:p>
@@ -3868,7 +3896,7 @@
                 <w:color w:val="17212B"/>
                 <w:sz w:val="16"/>
               </w:rPr>
-              <w:t>Public*</w:t>
+              <w:t>ADMIN</w:t>
             </w:r>
           </w:p>
         </w:tc>
@@ -3950,7 +3978,7 @@
                 <w:color w:val="17212B"/>
                 <w:sz w:val="16"/>
               </w:rPr>
-              <w:t>Public*</w:t>
+              <w:t>ADMIN</w:t>
             </w:r>
           </w:p>
         </w:tc>
@@ -4032,7 +4060,7 @@
                 <w:color w:val="17212B"/>
                 <w:sz w:val="16"/>
               </w:rPr>
-              <w:t>Public*</w:t>
+              <w:t>Owner/admin</w:t>
             </w:r>
           </w:p>
         </w:tc>
@@ -4114,7 +4142,7 @@
                 <w:color w:val="17212B"/>
                 <w:sz w:val="16"/>
               </w:rPr>
-              <w:t>Public*</w:t>
+              <w:t>Owner/admin</w:t>
             </w:r>
           </w:p>
         </w:tc>
@@ -4196,7 +4224,7 @@
                 <w:color w:val="17212B"/>
                 <w:sz w:val="16"/>
               </w:rPr>
-              <w:t>Public*</w:t>
+              <w:t>Owner/admin</w:t>
             </w:r>
           </w:p>
         </w:tc>
@@ -5708,7 +5736,7 @@
         <w:pStyle w:val="SmallNote"/>
       </w:pPr>
       <w:r>
-        <w:t>* Public access to /api/users/** is a known P0 gap, not a recommended production policy.</w:t>
+        <w:t>Legacy user creation still overlaps registration, but access is explicit: collection/create routes are ADMIN-only, item routes are owner/admin, and unmatched routes are denied by default.</w:t>
       </w:r>
     </w:p>
     <w:p>
@@ -6234,7 +6262,7 @@
                 <w:color w:val="17212B"/>
                 <w:sz w:val="17"/>
               </w:rPr>
-              <w:t>HTTP result pointer</w:t>
+              <w:t>HTTP replay metadata</w:t>
             </w:r>
           </w:p>
         </w:tc>
@@ -6254,7 +6282,7 @@
                 <w:color w:val="17212B"/>
                 <w:sz w:val="17"/>
               </w:rPr>
-              <w:t>key + path non-unique index</w:t>
+              <w:t>key + path UNIQUE; payment FK</w:t>
             </w:r>
           </w:p>
         </w:tc>
@@ -6580,15 +6608,18 @@
         <w:rPr>
           <w:rFonts w:ascii="Arial Unicode MS" w:hAnsi="Arial Unicode MS" w:eastAsia="Arial Unicode MS" w:cs="Arial Unicode MS"/>
         </w:rPr>
-        <w:t>Flyway V1 through V8 create the commerce schema, outbox, processing lease, processed events, order audit, refresh tokens, session metadata, and authentication audit in sequence. Hibernate uses ddl-auto=validate and open-in-view=false, so schema drift fails fast at startup.</w:t>
+        <w:t>Flyway V1 through V9 create the commerce schema, outbox, processing lease, processed events, order audit, refresh tokens, session metadata, authentication audit, and payment-idempotency hardening in sequence. Hibernate uses ddl-auto=validate and open-in-view=false, so schema drift fails fast at startup.</w:t>
       </w:r>
     </w:p>
     <w:p>
+      <w:pPr>
+        <w:keepLines/>
+      </w:pPr>
       <w:r>
         <w:rPr>
           <w:rFonts w:ascii="Arial Unicode MS" w:hAnsi="Arial Unicode MS" w:eastAsia="Arial Unicode MS" w:cs="Arial Unicode MS"/>
         </w:rPr>
-        <w:t>Scheduled retention removes processed_events older than 30 days and order_event_audit rows older than 90 days. An integration test confirms that only rows beyond each cutoff are deleted. Idempotency records, authentication audit, published outbox events, and expired refresh tokens still need complete lifecycle policies.</w:t>
+        <w:t>Scheduled retention removes processed_events older than 30 days and order_event_audit rows older than 90 days. An integration test confirms that only rows beyond each cutoff are deleted. Idempotency records now carry a 24-hour expiry timestamp, but cleanup and response-snapshot policy remain; authentication audit, published outbox events, and expired refresh tokens also need complete lifecycle policies.</w:t>
       </w:r>
     </w:p>
     <w:p>
@@ -7774,7 +7805,7 @@
                 <w:color w:val="17212B"/>
                 <w:sz w:val="15"/>
               </w:rPr>
-              <w:t>4</w:t>
+              <w:t>7</w:t>
             </w:r>
           </w:p>
         </w:tc>
@@ -7814,7 +7845,7 @@
                 <w:color w:val="17212B"/>
                 <w:sz w:val="15"/>
               </w:rPr>
-              <w:t>Outbox, retry key, concurrent key</w:t>
+              <w:t>Replay, conflict, DB uniqueness, races</w:t>
             </w:r>
           </w:p>
         </w:tc>
@@ -7918,7 +7949,7 @@
                 <w:color w:val="17212B"/>
                 <w:sz w:val="15"/>
               </w:rPr>
-              <w:t>AuthAuditIntegrationTest</w:t>
+              <w:t>UserAuthorizationIntegrationTest</w:t>
             </w:r>
           </w:p>
         </w:tc>
@@ -7958,7 +7989,7 @@
                 <w:color w:val="17212B"/>
                 <w:sz w:val="15"/>
               </w:rPr>
-              <w:t>DB/Metrics</w:t>
+              <w:t>API/Security</w:t>
             </w:r>
           </w:p>
         </w:tc>
@@ -7978,7 +8009,7 @@
                 <w:color w:val="17212B"/>
                 <w:sz w:val="15"/>
               </w:rPr>
-              <w:t>Success/failure/session audit</w:t>
+              <w:t>Anonymous, self, cross-user, admin</w:t>
             </w:r>
           </w:p>
         </w:tc>
@@ -8000,7 +8031,7 @@
                 <w:color w:val="17212B"/>
                 <w:sz w:val="15"/>
               </w:rPr>
-              <w:t>EventRetentionCleanupIntegrationTest</w:t>
+              <w:t>AuthAuditIntegrationTest</w:t>
             </w:r>
           </w:p>
         </w:tc>
@@ -8020,7 +8051,7 @@
                 <w:color w:val="17212B"/>
                 <w:sz w:val="15"/>
               </w:rPr>
-              <w:t>1</w:t>
+              <w:t>4</w:t>
             </w:r>
           </w:p>
         </w:tc>
@@ -8040,7 +8071,7 @@
                 <w:color w:val="17212B"/>
                 <w:sz w:val="15"/>
               </w:rPr>
-              <w:t>DB</w:t>
+              <w:t>DB/Metrics</w:t>
             </w:r>
           </w:p>
         </w:tc>
@@ -8060,7 +8091,7 @@
                 <w:color w:val="17212B"/>
                 <w:sz w:val="15"/>
               </w:rPr>
-              <w:t>Expired-only deletion</w:t>
+              <w:t>Success/failure/session audit</w:t>
             </w:r>
           </w:p>
         </w:tc>
@@ -8082,7 +8113,7 @@
                 <w:color w:val="17212B"/>
                 <w:sz w:val="15"/>
               </w:rPr>
-              <w:t>KafkaConsumerIdempotencyIntegrationTest</w:t>
+              <w:t>EventRetentionCleanupIntegrationTest</w:t>
             </w:r>
           </w:p>
         </w:tc>
@@ -8122,7 +8153,7 @@
                 <w:color w:val="17212B"/>
                 <w:sz w:val="15"/>
               </w:rPr>
-              <w:t>Kafka/DB</w:t>
+              <w:t>DB</w:t>
             </w:r>
           </w:p>
         </w:tc>
@@ -8142,7 +8173,7 @@
                 <w:color w:val="17212B"/>
                 <w:sz w:val="15"/>
               </w:rPr>
-              <w:t>Duplicate -&gt; one audit</w:t>
+              <w:t>Expired-only deletion</w:t>
             </w:r>
           </w:p>
         </w:tc>
@@ -8164,7 +8195,7 @@
                 <w:color w:val="17212B"/>
                 <w:sz w:val="15"/>
               </w:rPr>
-              <w:t>KafkaRetryDltIntegrationTest</w:t>
+              <w:t>KafkaConsumerIdempotencyIntegrationTest</w:t>
             </w:r>
           </w:p>
         </w:tc>
@@ -8204,7 +8235,7 @@
                 <w:color w:val="17212B"/>
                 <w:sz w:val="15"/>
               </w:rPr>
-              <w:t>Kafka</w:t>
+              <w:t>Kafka/DB</w:t>
             </w:r>
           </w:p>
         </w:tc>
@@ -8224,7 +8255,7 @@
                 <w:color w:val="17212B"/>
                 <w:sz w:val="15"/>
               </w:rPr>
-              <w:t>Retry exhaustion -&gt; DLT</w:t>
+              <w:t>Duplicate -&gt; one audit</w:t>
             </w:r>
           </w:p>
         </w:tc>
@@ -8246,7 +8277,7 @@
                 <w:color w:val="17212B"/>
                 <w:sz w:val="15"/>
               </w:rPr>
-              <w:t>OutboxEventClaimServiceIntegrationTest</w:t>
+              <w:t>KafkaRetryDltIntegrationTest</w:t>
             </w:r>
           </w:p>
         </w:tc>
@@ -8266,7 +8297,7 @@
                 <w:color w:val="17212B"/>
                 <w:sz w:val="15"/>
               </w:rPr>
-              <w:t>3</w:t>
+              <w:t>1</w:t>
             </w:r>
           </w:p>
         </w:tc>
@@ -8286,7 +8317,7 @@
                 <w:color w:val="17212B"/>
                 <w:sz w:val="15"/>
               </w:rPr>
-              <w:t>Concurrency</w:t>
+              <w:t>Kafka</w:t>
             </w:r>
           </w:p>
         </w:tc>
@@ -8306,7 +8337,7 @@
                 <w:color w:val="17212B"/>
                 <w:sz w:val="15"/>
               </w:rPr>
-              <w:t>Claim distribution + lease</w:t>
+              <w:t>Retry exhaustion -&gt; DLT</w:t>
             </w:r>
           </w:p>
         </w:tc>
@@ -8328,7 +8359,7 @@
                 <w:color w:val="17212B"/>
                 <w:sz w:val="15"/>
               </w:rPr>
-              <w:t>OutboxEventPublisherIntegrationTest</w:t>
+              <w:t>OutboxEventClaimServiceIntegrationTest</w:t>
             </w:r>
           </w:p>
         </w:tc>
@@ -8348,7 +8379,7 @@
                 <w:color w:val="17212B"/>
                 <w:sz w:val="15"/>
               </w:rPr>
-              <w:t>1</w:t>
+              <w:t>3</w:t>
             </w:r>
           </w:p>
         </w:tc>
@@ -8368,7 +8399,7 @@
                 <w:color w:val="17212B"/>
                 <w:sz w:val="15"/>
               </w:rPr>
-              <w:t>Kafka/DB</w:t>
+              <w:t>Concurrency</w:t>
             </w:r>
           </w:p>
         </w:tc>
@@ -8388,7 +8419,7 @@
                 <w:color w:val="17212B"/>
                 <w:sz w:val="15"/>
               </w:rPr>
-              <w:t>PENDING -&gt; PUBLISHED</w:t>
+              <w:t>Claim distribution + lease</w:t>
             </w:r>
           </w:p>
         </w:tc>
@@ -8410,7 +8441,7 @@
                 <w:color w:val="17212B"/>
                 <w:sz w:val="15"/>
               </w:rPr>
-              <w:t>OutboxEventPublisherRetryIntegrationTest</w:t>
+              <w:t>OutboxEventPublisherIntegrationTest</w:t>
             </w:r>
           </w:p>
         </w:tc>
@@ -8430,7 +8461,7 @@
                 <w:color w:val="17212B"/>
                 <w:sz w:val="15"/>
               </w:rPr>
-              <w:t>2</w:t>
+              <w:t>1</w:t>
             </w:r>
           </w:p>
         </w:tc>
@@ -8450,7 +8481,7 @@
                 <w:color w:val="17212B"/>
                 <w:sz w:val="15"/>
               </w:rPr>
-              <w:t>Failure</w:t>
+              <w:t>Kafka/DB</w:t>
             </w:r>
           </w:p>
         </w:tc>
@@ -8470,7 +8501,7 @@
                 <w:color w:val="17212B"/>
                 <w:sz w:val="15"/>
               </w:rPr>
-              <w:t>Retry + terminal FAILED</w:t>
+              <w:t>PENDING -&gt; PUBLISHED</w:t>
             </w:r>
           </w:p>
         </w:tc>
@@ -8492,7 +8523,7 @@
                 <w:color w:val="17212B"/>
                 <w:sz w:val="15"/>
               </w:rPr>
-              <w:t>ProcessedEventServiceIntegrationTest</w:t>
+              <w:t>OutboxEventPublisherRetryIntegrationTest</w:t>
             </w:r>
           </w:p>
         </w:tc>
@@ -8532,7 +8563,7 @@
                 <w:color w:val="17212B"/>
                 <w:sz w:val="15"/>
               </w:rPr>
-              <w:t>DB</w:t>
+              <w:t>Failure</w:t>
             </w:r>
           </w:p>
         </w:tc>
@@ -8552,7 +8583,7 @@
                 <w:color w:val="17212B"/>
                 <w:sz w:val="15"/>
               </w:rPr>
-              <w:t>Dedup + rollback marker</w:t>
+              <w:t>Retry + terminal FAILED</w:t>
             </w:r>
           </w:p>
         </w:tc>
@@ -8574,7 +8605,7 @@
                 <w:color w:val="17212B"/>
                 <w:sz w:val="15"/>
               </w:rPr>
-              <w:t>ProductControllerTest</w:t>
+              <w:t>ProcessedEventServiceIntegrationTest</w:t>
             </w:r>
           </w:p>
         </w:tc>
@@ -8594,7 +8625,7 @@
                 <w:color w:val="17212B"/>
                 <w:sz w:val="15"/>
               </w:rPr>
-              <w:t>6</w:t>
+              <w:t>2</w:t>
             </w:r>
           </w:p>
         </w:tc>
@@ -8614,7 +8645,7 @@
                 <w:color w:val="17212B"/>
                 <w:sz w:val="15"/>
               </w:rPr>
-              <w:t>Component</w:t>
+              <w:t>DB</w:t>
             </w:r>
           </w:p>
         </w:tc>
@@ -8634,7 +8665,7 @@
                 <w:color w:val="17212B"/>
                 <w:sz w:val="15"/>
               </w:rPr>
-              <w:t>Response and sorting delegation</w:t>
+              <w:t>Dedup + rollback marker</w:t>
             </w:r>
           </w:p>
         </w:tc>
@@ -8656,7 +8687,7 @@
                 <w:color w:val="17212B"/>
                 <w:sz w:val="15"/>
               </w:rPr>
-              <w:t>GlobalExceptionHandlerTest</w:t>
+              <w:t>ProductControllerTest</w:t>
             </w:r>
           </w:p>
         </w:tc>
@@ -8676,7 +8707,7 @@
                 <w:color w:val="17212B"/>
                 <w:sz w:val="15"/>
               </w:rPr>
-              <w:t>5</w:t>
+              <w:t>6</w:t>
             </w:r>
           </w:p>
         </w:tc>
@@ -8716,7 +8747,7 @@
                 <w:color w:val="17212B"/>
                 <w:sz w:val="15"/>
               </w:rPr>
-              <w:t>Validation / 400 / 404 / 409</w:t>
+              <w:t>Response and sorting delegation</w:t>
             </w:r>
           </w:p>
         </w:tc>
@@ -8738,7 +8769,7 @@
                 <w:color w:val="17212B"/>
                 <w:sz w:val="15"/>
               </w:rPr>
-              <w:t>CartServiceTest</w:t>
+              <w:t>GlobalExceptionHandlerTest</w:t>
             </w:r>
           </w:p>
         </w:tc>
@@ -8758,7 +8789,7 @@
                 <w:color w:val="17212B"/>
                 <w:sz w:val="15"/>
               </w:rPr>
-              <w:t>13</w:t>
+              <w:t>5</w:t>
             </w:r>
           </w:p>
         </w:tc>
@@ -8778,7 +8809,7 @@
                 <w:color w:val="17212B"/>
                 <w:sz w:val="15"/>
               </w:rPr>
-              <w:t>Unit</w:t>
+              <w:t>Component</w:t>
             </w:r>
           </w:p>
         </w:tc>
@@ -8798,7 +8829,7 @@
                 <w:color w:val="17212B"/>
                 <w:sz w:val="15"/>
               </w:rPr>
-              <w:t>CRUD, ownership, stock, errors</w:t>
+              <w:t>Validation / 400 / 404 / 409</w:t>
             </w:r>
           </w:p>
         </w:tc>
@@ -8820,7 +8851,7 @@
                 <w:color w:val="17212B"/>
                 <w:sz w:val="15"/>
               </w:rPr>
-              <w:t>OrderServiceTest</w:t>
+              <w:t>CartServiceTest</w:t>
             </w:r>
           </w:p>
         </w:tc>
@@ -8840,7 +8871,7 @@
                 <w:color w:val="17212B"/>
                 <w:sz w:val="15"/>
               </w:rPr>
-              <w:t>9</w:t>
+              <w:t>13</w:t>
             </w:r>
           </w:p>
         </w:tc>
@@ -8880,7 +8911,7 @@
                 <w:color w:val="17212B"/>
                 <w:sz w:val="15"/>
               </w:rPr>
-              <w:t>Create, snapshot, stock, cancel</w:t>
+              <w:t>CRUD, ownership, stock, errors</w:t>
             </w:r>
           </w:p>
         </w:tc>
@@ -8902,7 +8933,7 @@
                 <w:color w:val="17212B"/>
                 <w:sz w:val="15"/>
               </w:rPr>
-              <w:t>OutboxEventPublisherTest</w:t>
+              <w:t>OrderServiceTest</w:t>
             </w:r>
           </w:p>
         </w:tc>
@@ -8922,7 +8953,7 @@
                 <w:color w:val="17212B"/>
                 <w:sz w:val="15"/>
               </w:rPr>
-              <w:t>5</w:t>
+              <w:t>9</w:t>
             </w:r>
           </w:p>
         </w:tc>
@@ -8962,7 +8993,7 @@
                 <w:color w:val="17212B"/>
                 <w:sz w:val="15"/>
               </w:rPr>
-              <w:t>Claim, publish, retry, failed</w:t>
+              <w:t>Create, snapshot, stock, cancel</w:t>
             </w:r>
           </w:p>
         </w:tc>
@@ -8984,7 +9015,7 @@
                 <w:color w:val="17212B"/>
                 <w:sz w:val="15"/>
               </w:rPr>
-              <w:t>OutboxMetricsTest</w:t>
+              <w:t>OutboxEventPublisherTest</w:t>
             </w:r>
           </w:p>
         </w:tc>
@@ -9004,7 +9035,7 @@
                 <w:color w:val="17212B"/>
                 <w:sz w:val="15"/>
               </w:rPr>
-              <w:t>3</w:t>
+              <w:t>5</w:t>
             </w:r>
           </w:p>
         </w:tc>
@@ -9044,7 +9075,7 @@
                 <w:color w:val="17212B"/>
                 <w:sz w:val="15"/>
               </w:rPr>
-              <w:t>Counters, guards, gauges</w:t>
+              <w:t>Claim, publish, retry, failed</w:t>
             </w:r>
           </w:p>
         </w:tc>
@@ -9066,7 +9097,7 @@
                 <w:color w:val="17212B"/>
                 <w:sz w:val="15"/>
               </w:rPr>
-              <w:t>PaymentServiceTest</w:t>
+              <w:t>OutboxMetricsTest</w:t>
             </w:r>
           </w:p>
         </w:tc>
@@ -9086,7 +9117,7 @@
                 <w:color w:val="17212B"/>
                 <w:sz w:val="15"/>
               </w:rPr>
-              <w:t>13</w:t>
+              <w:t>3</w:t>
             </w:r>
           </w:p>
         </w:tc>
@@ -9126,7 +9157,7 @@
                 <w:color w:val="17212B"/>
                 <w:sz w:val="15"/>
               </w:rPr>
-              <w:t>Idempotency and transaction paths</w:t>
+              <w:t>Counters, guards, gauges</w:t>
             </w:r>
           </w:p>
         </w:tc>
@@ -9148,7 +9179,7 @@
                 <w:color w:val="17212B"/>
                 <w:sz w:val="15"/>
               </w:rPr>
-              <w:t>ProductServiceTest</w:t>
+              <w:t>PaymentServiceTest</w:t>
             </w:r>
           </w:p>
         </w:tc>
@@ -9168,7 +9199,7 @@
                 <w:color w:val="17212B"/>
                 <w:sz w:val="15"/>
               </w:rPr>
-              <w:t>8</w:t>
+              <w:t>15</w:t>
             </w:r>
           </w:p>
         </w:tc>
@@ -9208,7 +9239,7 @@
                 <w:color w:val="17212B"/>
                 <w:sz w:val="15"/>
               </w:rPr>
-              <w:t>CRUD, pagination, errors</w:t>
+              <w:t>Fingerprint, key validation, transactions</w:t>
             </w:r>
           </w:p>
         </w:tc>
@@ -9230,6 +9261,88 @@
                 <w:color w:val="17212B"/>
                 <w:sz w:val="15"/>
               </w:rPr>
+              <w:t>ProductServiceTest</w:t>
+            </w:r>
+          </w:p>
+        </w:tc>
+        <w:tc>
+          <w:tcPr>
+            <w:tcW w:type="dxa" w:w="650"/>
+          </w:tcPr>
+          <w:p>
+            <w:pPr>
+              <w:spacing w:before="0" w:after="0" w:line="259" w:lineRule="auto"/>
+              <w:jc w:val="center"/>
+            </w:pPr>
+            <w:r>
+              <w:rPr>
+                <w:rFonts w:ascii="Arial Unicode MS" w:hAnsi="Arial Unicode MS" w:eastAsia="Arial Unicode MS" w:cs="Arial Unicode MS"/>
+                <w:b w:val="0"/>
+                <w:color w:val="17212B"/>
+                <w:sz w:val="15"/>
+              </w:rPr>
+              <w:t>8</w:t>
+            </w:r>
+          </w:p>
+        </w:tc>
+        <w:tc>
+          <w:tcPr>
+            <w:tcW w:type="dxa" w:w="1800"/>
+          </w:tcPr>
+          <w:p>
+            <w:pPr>
+              <w:spacing w:before="0" w:after="0" w:line="259" w:lineRule="auto"/>
+              <w:jc w:val="left"/>
+            </w:pPr>
+            <w:r>
+              <w:rPr>
+                <w:rFonts w:ascii="Arial Unicode MS" w:hAnsi="Arial Unicode MS" w:eastAsia="Arial Unicode MS" w:cs="Arial Unicode MS"/>
+                <w:b w:val="0"/>
+                <w:color w:val="17212B"/>
+                <w:sz w:val="15"/>
+              </w:rPr>
+              <w:t>Unit</w:t>
+            </w:r>
+          </w:p>
+        </w:tc>
+        <w:tc>
+          <w:tcPr>
+            <w:tcW w:type="dxa" w:w="3410"/>
+          </w:tcPr>
+          <w:p>
+            <w:pPr>
+              <w:spacing w:before="0" w:after="0" w:line="259" w:lineRule="auto"/>
+              <w:jc w:val="left"/>
+            </w:pPr>
+            <w:r>
+              <w:rPr>
+                <w:rFonts w:ascii="Arial Unicode MS" w:hAnsi="Arial Unicode MS" w:eastAsia="Arial Unicode MS" w:cs="Arial Unicode MS"/>
+                <w:b w:val="0"/>
+                <w:color w:val="17212B"/>
+                <w:sz w:val="15"/>
+              </w:rPr>
+              <w:t>CRUD, pagination, errors</w:t>
+            </w:r>
+          </w:p>
+        </w:tc>
+      </w:tr>
+      <w:tr>
+        <w:tc>
+          <w:tcPr>
+            <w:tcW w:type="dxa" w:w="3500"/>
+          </w:tcPr>
+          <w:p>
+            <w:pPr>
+              <w:spacing w:before="0" w:after="0" w:line="259" w:lineRule="auto"/>
+              <w:jc w:val="left"/>
+            </w:pPr>
+            <w:r>
+              <w:rPr>
+                <w:rFonts w:ascii="Arial Unicode MS" w:hAnsi="Arial Unicode MS" w:eastAsia="Arial Unicode MS" w:cs="Arial Unicode MS"/>
+                <w:b w:val="0"/>
+                <w:color w:val="17212B"/>
+                <w:sz w:val="15"/>
+              </w:rPr>
               <w:t>TOTAL</w:t>
             </w:r>
           </w:p>
@@ -9250,7 +9363,7 @@
                 <w:color w:val="17212B"/>
                 <w:sz w:val="15"/>
               </w:rPr>
-              <w:t>104</w:t>
+              <w:t>113</w:t>
             </w:r>
           </w:p>
         </w:tc>
@@ -9270,7 +9383,7 @@
                 <w:color w:val="17212B"/>
                 <w:sz w:val="15"/>
               </w:rPr>
-              <w:t>62 unit/component + 42 integration</w:t>
+              <w:t>64 unit/component + 49 integration</w:t>
             </w:r>
           </w:p>
         </w:tc>
@@ -9290,7 +9403,7 @@
                 <w:color w:val="17212B"/>
                 <w:sz w:val="15"/>
               </w:rPr>
-              <w:t>104 passed; 0 failed/error/skipped</w:t>
+              <w:t>113 passed; 0 failed/error/skipped</w:t>
             </w:r>
           </w:p>
         </w:tc>
@@ -9498,7 +9611,7 @@
                 <w:color w:val="17212B"/>
                 <w:sz w:val="18"/>
               </w:rPr>
-              <w:t>5,102</w:t>
+              <w:t>5,638</w:t>
             </w:r>
           </w:p>
         </w:tc>
@@ -9518,7 +9631,7 @@
                 <w:color w:val="17212B"/>
                 <w:sz w:val="18"/>
               </w:rPr>
-              <w:t>1,160</w:t>
+              <w:t>825</w:t>
             </w:r>
           </w:p>
         </w:tc>
@@ -9538,7 +9651,7 @@
                 <w:color w:val="17212B"/>
                 <w:sz w:val="18"/>
               </w:rPr>
-              <w:t>6,262</w:t>
+              <w:t>6,463</w:t>
             </w:r>
           </w:p>
         </w:tc>
@@ -9558,7 +9671,7 @@
                 <w:color w:val="17212B"/>
                 <w:sz w:val="18"/>
               </w:rPr>
-              <w:t>81.48%</w:t>
+              <w:t>87.24%</w:t>
             </w:r>
           </w:p>
         </w:tc>
@@ -9600,7 +9713,7 @@
                 <w:color w:val="17212B"/>
                 <w:sz w:val="18"/>
               </w:rPr>
-              <w:t>112</w:t>
+              <w:t>120</w:t>
             </w:r>
           </w:p>
         </w:tc>
@@ -9620,7 +9733,7 @@
                 <w:color w:val="17212B"/>
                 <w:sz w:val="18"/>
               </w:rPr>
-              <w:t>52</w:t>
+              <w:t>48</w:t>
             </w:r>
           </w:p>
         </w:tc>
@@ -9640,7 +9753,7 @@
                 <w:color w:val="17212B"/>
                 <w:sz w:val="18"/>
               </w:rPr>
-              <w:t>164</w:t>
+              <w:t>168</w:t>
             </w:r>
           </w:p>
         </w:tc>
@@ -9660,7 +9773,7 @@
                 <w:color w:val="17212B"/>
                 <w:sz w:val="18"/>
               </w:rPr>
-              <w:t>68.29%</w:t>
+              <w:t>71.43%</w:t>
             </w:r>
           </w:p>
         </w:tc>
@@ -9702,7 +9815,7 @@
                 <w:color w:val="17212B"/>
                 <w:sz w:val="18"/>
               </w:rPr>
-              <w:t>1,399</w:t>
+              <w:t>1,541</w:t>
             </w:r>
           </w:p>
         </w:tc>
@@ -9722,7 +9835,7 @@
                 <w:color w:val="17212B"/>
                 <w:sz w:val="18"/>
               </w:rPr>
-              <w:t>331</w:t>
+              <w:t>239</w:t>
             </w:r>
           </w:p>
         </w:tc>
@@ -9742,7 +9855,7 @@
                 <w:color w:val="17212B"/>
                 <w:sz w:val="18"/>
               </w:rPr>
-              <w:t>1,730</w:t>
+              <w:t>1,780</w:t>
             </w:r>
           </w:p>
         </w:tc>
@@ -9762,7 +9875,7 @@
                 <w:color w:val="17212B"/>
                 <w:sz w:val="18"/>
               </w:rPr>
-              <w:t>80.87%</w:t>
+              <w:t>86.57%</w:t>
             </w:r>
           </w:p>
         </w:tc>
@@ -9804,7 +9917,7 @@
                 <w:color w:val="17212B"/>
                 <w:sz w:val="18"/>
               </w:rPr>
-              <w:t>466</w:t>
+              <w:t>516</w:t>
             </w:r>
           </w:p>
         </w:tc>
@@ -9824,7 +9937,7 @@
                 <w:color w:val="17212B"/>
                 <w:sz w:val="18"/>
               </w:rPr>
-              <w:t>158</w:t>
+              <w:t>121</w:t>
             </w:r>
           </w:p>
         </w:tc>
@@ -9844,7 +9957,7 @@
                 <w:color w:val="17212B"/>
                 <w:sz w:val="18"/>
               </w:rPr>
-              <w:t>624</w:t>
+              <w:t>637</w:t>
             </w:r>
           </w:p>
         </w:tc>
@@ -9864,7 +9977,7 @@
                 <w:color w:val="17212B"/>
                 <w:sz w:val="18"/>
               </w:rPr>
-              <w:t>74.68%</w:t>
+              <w:t>81.00%</w:t>
             </w:r>
           </w:p>
         </w:tc>
@@ -9906,7 +10019,7 @@
                 <w:color w:val="17212B"/>
                 <w:sz w:val="18"/>
               </w:rPr>
-              <w:t>426</w:t>
+              <w:t>472</w:t>
             </w:r>
           </w:p>
         </w:tc>
@@ -9926,7 +10039,7 @@
                 <w:color w:val="17212B"/>
                 <w:sz w:val="18"/>
               </w:rPr>
-              <w:t>116</w:t>
+              <w:t>81</w:t>
             </w:r>
           </w:p>
         </w:tc>
@@ -9946,7 +10059,7 @@
                 <w:color w:val="17212B"/>
                 <w:sz w:val="18"/>
               </w:rPr>
-              <w:t>542</w:t>
+              <w:t>553</w:t>
             </w:r>
           </w:p>
         </w:tc>
@@ -9966,7 +10079,7 @@
                 <w:color w:val="17212B"/>
                 <w:sz w:val="18"/>
               </w:rPr>
-              <w:t>78.60%</w:t>
+              <w:t>85.35%</w:t>
             </w:r>
           </w:p>
         </w:tc>
@@ -10008,7 +10121,7 @@
                 <w:color w:val="17212B"/>
                 <w:sz w:val="18"/>
               </w:rPr>
-              <w:t>84</w:t>
+              <w:t>90</w:t>
             </w:r>
           </w:p>
         </w:tc>
@@ -10028,7 +10141,7 @@
                 <w:color w:val="17212B"/>
                 <w:sz w:val="18"/>
               </w:rPr>
-              <w:t>6</w:t>
+              <w:t>2</w:t>
             </w:r>
           </w:p>
         </w:tc>
@@ -10048,7 +10161,7 @@
                 <w:color w:val="17212B"/>
                 <w:sz w:val="18"/>
               </w:rPr>
-              <w:t>90</w:t>
+              <w:t>92</w:t>
             </w:r>
           </w:p>
         </w:tc>
@@ -10068,7 +10181,7 @@
                 <w:color w:val="17212B"/>
                 <w:sz w:val="18"/>
               </w:rPr>
-              <w:t>93.33%</w:t>
+              <w:t>97.83%</w:t>
             </w:r>
           </w:p>
         </w:tc>
@@ -11514,89 +11627,6 @@
                 <w:color w:val="17212B"/>
                 <w:sz w:val="16"/>
               </w:rPr>
-              <w:t>Public legacy user CRUD</w:t>
-            </w:r>
-          </w:p>
-        </w:tc>
-        <w:tc>
-          <w:tcPr>
-            <w:tcW w:type="dxa" w:w="2600"/>
-          </w:tcPr>
-          <w:p>
-            <w:pPr>
-              <w:spacing w:before="0" w:after="0" w:line="259" w:lineRule="auto"/>
-              <w:jc w:val="left"/>
-            </w:pPr>
-            <w:r>
-              <w:rPr>
-                <w:rFonts w:ascii="Arial Unicode MS" w:hAnsi="Arial Unicode MS" w:eastAsia="Arial Unicode MS" w:cs="Arial Unicode MS"/>
-                <w:b w:val="0"/>
-                <w:color w:val="17212B"/>
-                <w:sz w:val="16"/>
-              </w:rPr>
-              <w:t>Unauthorized read/update/delete</w:t>
-            </w:r>
-          </w:p>
-        </w:tc>
-        <w:tc>
-          <w:tcPr>
-            <w:tcW w:type="dxa" w:w="3260"/>
-          </w:tcPr>
-          <w:p>
-            <w:pPr>
-              <w:spacing w:before="0" w:after="0" w:line="259" w:lineRule="auto"/>
-              <w:jc w:val="left"/>
-            </w:pPr>
-            <w:r>
-              <w:rPr>
-                <w:rFonts w:ascii="Arial Unicode MS" w:hAnsi="Arial Unicode MS" w:eastAsia="Arial Unicode MS" w:cs="Arial Unicode MS"/>
-                <w:b w:val="0"/>
-                <w:color w:val="17212B"/>
-                <w:sz w:val="16"/>
-              </w:rPr>
-              <w:t>Remove or enforce admin/self policy + tests</w:t>
-            </w:r>
-          </w:p>
-        </w:tc>
-      </w:tr>
-      <w:tr>
-        <w:tc>
-          <w:tcPr>
-            <w:tcW w:type="dxa" w:w="1000"/>
-            <w:shd w:val="clear" w:color="auto" w:fill="FCECEC"/>
-          </w:tcPr>
-          <w:p>
-            <w:pPr>
-              <w:spacing w:before="0" w:after="0" w:line="259" w:lineRule="auto"/>
-              <w:jc w:val="left"/>
-            </w:pPr>
-            <w:r>
-              <w:rPr>
-                <w:rFonts w:ascii="Arial Unicode MS" w:hAnsi="Arial Unicode MS" w:eastAsia="Arial Unicode MS" w:cs="Arial Unicode MS"/>
-                <w:b/>
-                <w:color w:val="9B1C1C"/>
-                <w:sz w:val="16"/>
-              </w:rPr>
-              <w:t>P0</w:t>
-            </w:r>
-          </w:p>
-        </w:tc>
-        <w:tc>
-          <w:tcPr>
-            <w:tcW w:type="dxa" w:w="2500"/>
-          </w:tcPr>
-          <w:p>
-            <w:pPr>
-              <w:spacing w:before="0" w:after="0" w:line="259" w:lineRule="auto"/>
-              <w:jc w:val="center"/>
-            </w:pPr>
-            <w:r>
-              <w:rPr>
-                <w:rFonts w:ascii="Arial Unicode MS" w:hAnsi="Arial Unicode MS" w:eastAsia="Arial Unicode MS" w:cs="Arial Unicode MS"/>
-                <w:b w:val="0"/>
-                <w:color w:val="17212B"/>
-                <w:sz w:val="16"/>
-              </w:rPr>
               <w:t>Env/file-based secrets</w:t>
             </w:r>
           </w:p>
@@ -11680,7 +11710,7 @@
                 <w:color w:val="17212B"/>
                 <w:sz w:val="16"/>
               </w:rPr>
-              <w:t>Non-unique idempotency key/path</w:t>
+              <w:t>Idempotency cleanup/snapshot policy</w:t>
             </w:r>
           </w:p>
         </w:tc>
@@ -11700,7 +11730,7 @@
                 <w:color w:val="17212B"/>
                 <w:sz w:val="16"/>
               </w:rPr>
-              <w:t>Ambiguous general retry semantics</w:t>
+              <w:t>Expired rows / evolving reconstruction</w:t>
             </w:r>
           </w:p>
         </w:tc>
@@ -11720,7 +11750,7 @@
                 <w:color w:val="17212B"/>
                 <w:sz w:val="16"/>
               </w:rPr>
-              <w:t>Unique key, fingerprint, response snapshot</w:t>
+              <w:t>Cleanup, retention metrics, optional snapshot</w:t>
             </w:r>
           </w:p>
         </w:tc>
@@ -12550,7 +12580,7 @@
         <w:rPr>
           <w:rFonts w:ascii="Arial Unicode MS" w:hAnsi="Arial Unicode MS" w:eastAsia="Arial Unicode MS" w:cs="Arial Unicode MS"/>
         </w:rPr>
-        <w:t>Payment idempotency uses a database lock, transaction, unique payment invariant, and concurrent verification rather than only accepting a header.</w:t>
+        <w:t>Payment idempotency uses a database lock, two unique invariants, a request fingerprint, replay metadata, and same-key and terminal-transition concurrency verification.</w:t>
       </w:r>
     </w:p>
     <w:p>
@@ -12650,7 +12680,7 @@
         <w:pStyle w:val="Heading2"/>
       </w:pPr>
       <w:r>
-        <w:t>Phase 1 — Security and correctness closure</w:t>
+        <w:t>Phase 1 — Remaining correctness cleanup</w:t>
       </w:r>
     </w:p>
     <w:p>
@@ -12664,7 +12694,7 @@
         <w:rPr>
           <w:rFonts w:ascii="Arial Unicode MS" w:hAnsi="Arial Unicode MS" w:eastAsia="Arial Unicode MS" w:cs="Arial Unicode MS"/>
         </w:rPr>
-        <w:t>Fix or remove the /api/users legacy CRUD authorization gap.</w:t>
+        <w:t>Add idempotency expiry cleanup, retention metrics, and an optional immutable response snapshot.</w:t>
       </w:r>
     </w:p>
     <w:p>
@@ -12678,7 +12708,7 @@
         <w:rPr>
           <w:rFonts w:ascii="Arial Unicode MS" w:hAnsi="Arial Unicode MS" w:eastAsia="Arial Unicode MS" w:cs="Arial Unicode MS"/>
         </w:rPr>
-        <w:t>Add an idempotency unique constraint, request fingerprint, response snapshot, expiry, and retention.</w:t>
+        <w:t>Remove or isolate the educational slow-order endpoint.</w:t>
       </w:r>
     </w:p>
     <w:p>
@@ -12692,7 +12722,7 @@
         <w:rPr>
           <w:rFonts w:ascii="Arial Unicode MS" w:hAnsi="Arial Unicode MS" w:eastAsia="Arial Unicode MS" w:cs="Arial Unicode MS"/>
         </w:rPr>
-        <w:t>Add cancel-versus-pay concurrency and state-transition tests.</w:t>
+        <w:t>Define trusted-proxy handling before honoring forwarded client addresses.</w:t>
       </w:r>
     </w:p>
     <w:p>
@@ -12878,7 +12908,7 @@
         <w:pStyle w:val="Lead"/>
       </w:pPr>
       <w:r>
-        <w:t>Verified evidence: 104 of 104 tests passed; instruction coverage is 81.48%; branch coverage is 68.29%; the Maven coverage gate and regression baseline both passed. Known boundaries: public legacy user API, single-host topology, simulated payment, DLT operations gap, and unverified cloud deployment.</w:t>
+        <w:t>Verified evidence: 113 of 113 tests passed; instruction coverage is 87.24%; branch coverage is 71.43%; the Maven coverage gate and regression baseline both passed. Known boundaries: idempotency cleanup policy, single-host topology, simulated payment, DLT operations gap, and unverified cloud deployment.</w:t>
       </w:r>
     </w:p>
     <w:sectPr>

</xml_diff>

<commit_message>
feat: harden authorization and payment idempotency (#25)
</commit_message>
<xml_diff>
--- a/System_Design_and_Engineering_Portfolio.docx
+++ b/System_Design_and_Engineering_Portfolio.docx
@@ -184,7 +184,7 @@
                 <w:color w:val="18324B"/>
                 <w:sz w:val="36"/>
               </w:rPr>
-              <w:t>104</w:t>
+              <w:t>113</w:t>
             </w:r>
           </w:p>
         </w:tc>
@@ -204,7 +204,7 @@
                 <w:color w:val="18324B"/>
                 <w:sz w:val="36"/>
               </w:rPr>
-              <w:t>81.48%</w:t>
+              <w:t>87.24%</w:t>
             </w:r>
           </w:p>
         </w:tc>
@@ -224,7 +224,7 @@
                 <w:color w:val="18324B"/>
                 <w:sz w:val="36"/>
               </w:rPr>
-              <w:t>68.29%</w:t>
+              <w:t>71.43%</w:t>
             </w:r>
           </w:p>
         </w:tc>
@@ -244,7 +244,7 @@
                 <w:color w:val="18324B"/>
                 <w:sz w:val="36"/>
               </w:rPr>
-              <w:t>8</w:t>
+              <w:t>9</w:t>
             </w:r>
           </w:p>
         </w:tc>
@@ -280,7 +280,7 @@
         <w:jc w:val="center"/>
       </w:pPr>
       <w:r>
-        <w:t>Verified baseline: 2026-08-05  |  Git HEAD ffbe94e</w:t>
+        <w:t>Verified baseline: 2026-08-05  |  HEAD 79971f8 + Phase 1 hardening</w:t>
       </w:r>
     </w:p>
     <w:p>
@@ -457,7 +457,21 @@
         <w:rPr>
           <w:rFonts w:ascii="Arial Unicode MS" w:hAnsi="Arial Unicode MS" w:eastAsia="Arial Unicode MS" w:cs="Arial Unicode MS"/>
         </w:rPr>
-        <w:t>Concurrent payments for one order are serialized by a pessimistic lock, a one-payment-per-order constraint, and a second idempotency lookup.</w:t>
+        <w:t>Payment and cancellation share one pessimistic order lock; payment replay also uses payment and key/path uniqueness constraints.</w:t>
+      </w:r>
+    </w:p>
+    <w:p>
+      <w:pPr>
+        <w:numPr>
+          <w:ilvl w:val="0"/>
+          <w:numId w:val="10"/>
+        </w:numPr>
+      </w:pPr>
+      <w:r>
+        <w:rPr>
+          <w:rFonts w:ascii="Arial Unicode MS" w:hAnsi="Arial Unicode MS" w:eastAsia="Arial Unicode MS" w:cs="Arial Unicode MS"/>
+        </w:rPr>
+        <w:t>SHA-256 request fingerprints reject same-key/different-method retries, while response status, payment reference, and expiry metadata are persisted.</w:t>
       </w:r>
     </w:p>
     <w:p>
@@ -513,7 +527,7 @@
         <w:rPr>
           <w:rFonts w:ascii="Arial Unicode MS" w:hAnsi="Arial Unicode MS" w:eastAsia="Arial Unicode MS" w:cs="Arial Unicode MS"/>
         </w:rPr>
-        <w:t>104 tests, a JaCoCo gate, a coverage regression baseline, CodeQL, and Dependabot provide automated quality evidence.</w:t>
+        <w:t>113 tests, a JaCoCo gate, a coverage regression baseline, CodeQL, and Dependabot provide automated quality evidence.</w:t>
       </w:r>
     </w:p>
     <w:p>
@@ -541,7 +555,7 @@
           <w:color w:val="18324B"/>
           <w:sz w:val="21"/>
         </w:rPr>
-        <w:t>The accurate positioning is a backend engineering portfolio with production thinking. It does not yet have the complete authorization boundary, HA topology, real payment integration, DLT operations, or verified cloud deployment required for a commercial production service.</w:t>
+        <w:t>The accurate positioning is a backend engineering portfolio with production thinking. The user-API authorization gap and core payment-idempotency constraints are closed; HA topology, real payment integration, DLT operations, and verified cloud delivery remain before commercial production use.</w:t>
       </w:r>
     </w:p>
     <w:p>
@@ -557,7 +571,7 @@
         <w:pStyle w:val="TableCaption"/>
       </w:pPr>
       <w:r>
-        <w:t>Table 1 | Isolated snapshot verification on 2026-08-05</w:t>
+        <w:t>Table 1 | Local working-tree verification on 2026-08-05</w:t>
       </w:r>
     </w:p>
     <w:tbl>
@@ -756,7 +770,7 @@
                 <w:color w:val="17212B"/>
                 <w:sz w:val="18"/>
               </w:rPr>
-              <w:t>104 passed / 0 failed / 0 errors / 0 skipped</w:t>
+              <w:t>113 passed / 0 failed / 0 errors / 0 skipped</w:t>
             </w:r>
           </w:p>
         </w:tc>
@@ -798,7 +812,7 @@
                 <w:color w:val="17212B"/>
                 <w:sz w:val="18"/>
               </w:rPr>
-              <w:t>23 (62 unit/component + 42 integration tests)</w:t>
+              <w:t>24 (64 unit/component + 49 integration tests)</w:t>
             </w:r>
           </w:p>
         </w:tc>
@@ -882,7 +896,7 @@
                 <w:color w:val="17212B"/>
                 <w:sz w:val="18"/>
               </w:rPr>
-              <w:t>81.48% / 68.29% / 80.87%</w:t>
+              <w:t>87.24% / 71.43% / 86.57%</w:t>
             </w:r>
           </w:p>
         </w:tc>
@@ -1008,7 +1022,7 @@
                 <w:color w:val="17212B"/>
                 <w:sz w:val="18"/>
               </w:rPr>
-              <w:t>43.776 seconds on the local verification environment</w:t>
+              <w:t>43.246 seconds on the local verification environment</w:t>
             </w:r>
           </w:p>
         </w:tc>
@@ -1024,7 +1038,7 @@
         <w:pStyle w:val="SmallNote"/>
       </w:pPr>
       <w:r>
-        <w:t>Verification ran in an isolated snapshot without overwriting the original repository's target artifacts. Mockito required an explicit Byte Buddy agent in the restricted JDK 25 environment; all 104 tests still executed with no skip or quarantine.</w:t>
+        <w:t>Verification ran in the local working tree against disposable Testcontainers infrastructure. Mockito required an explicit Byte Buddy agent in the restricted JDK 25 environment; all 113 tests still executed with no skip or quarantine.</w:t>
       </w:r>
     </w:p>
     <w:p>
@@ -1546,7 +1560,7 @@
                 <w:color w:val="17212B"/>
                 <w:sz w:val="18"/>
               </w:rPr>
-              <w:t>8</w:t>
+              <w:t>9</w:t>
             </w:r>
           </w:p>
         </w:tc>
@@ -1566,7 +1580,7 @@
                 <w:color w:val="17212B"/>
                 <w:sz w:val="18"/>
               </w:rPr>
-              <w:t>Schema v1 to v8</w:t>
+              <w:t>Schema v1 to v9</w:t>
             </w:r>
           </w:p>
         </w:tc>
@@ -1608,7 +1622,7 @@
                 <w:color w:val="17212B"/>
                 <w:sz w:val="18"/>
               </w:rPr>
-              <w:t>24 files</w:t>
+              <w:t>25 files</w:t>
             </w:r>
           </w:p>
         </w:tc>
@@ -1628,7 +1642,7 @@
                 <w:color w:val="17212B"/>
                 <w:sz w:val="18"/>
               </w:rPr>
-              <w:t>23 suites + shared Testcontainers base</w:t>
+              <w:t>24 suites + shared Testcontainers base</w:t>
             </w:r>
           </w:p>
         </w:tc>
@@ -1884,7 +1898,7 @@
         <w:rPr>
           <w:rFonts w:ascii="Arial Unicode MS" w:hAnsi="Arial Unicode MS" w:eastAsia="Arial Unicode MS" w:cs="Arial Unicode MS"/>
         </w:rPr>
-        <w:t>Cancellation accepts only PENDING, restores stock, and transitions the order to CANCELLED. /orders/slow adds a deliberate five-second delay for the optimistic-lock lab; a production service should replace the exposed slow endpoint with a test harness.</w:t>
+        <w:t>Cancellation accepts only PENDING, shares the payment pessimistic lock, restores stock, and transitions the order to CANCELLED. A scalar owner-ID authorization query avoids stale order entities before locking. /orders/slow remains a lab endpoint that should move into a test harness.</w:t>
       </w:r>
     </w:p>
     <w:p>
@@ -1911,7 +1925,7 @@
           <w:color w:val="17212B"/>
           <w:sz w:val="17"/>
         </w:rPr>
-        <w:t>idempotency lookup</w:t>
+        <w:t>key/path lookup + request fingerprint check</w:t>
         <w:br/>
         <w:t xml:space="preserve">  -&gt; SELECT order FOR UPDATE</w:t>
         <w:br/>
@@ -1919,7 +1933,7 @@
         <w:br/>
         <w:t xml:space="preserve">  -&gt; validate PENDING / no existing payment</w:t>
         <w:br/>
-        <w:t xml:space="preserve">  -&gt; payment + idempotency record + order PAID + PAYMENT_PAID outbox</w:t>
+        <w:t xml:space="preserve">  -&gt; payment + replay metadata + order PAID + PAYMENT_PAID outbox</w:t>
         <w:br/>
         <w:t xml:space="preserve">  -&gt; one PostgreSQL commit</w:t>
       </w:r>
@@ -1929,7 +1943,7 @@
         <w:rPr>
           <w:rFonts w:ascii="Arial Unicode MS" w:hAnsi="Arial Unicode MS" w:eastAsia="Arial Unicode MS" w:cs="Arial Unicode MS"/>
         </w:rPr>
-        <w:t>The primary database guarantees are the order pessimistic lock and payments.order_id UNIQUE. idempotency_records has only a non-unique (key, path) index. A generalized contract should add a unique constraint, request fingerprint, stored response, expiry, and cleanup.</w:t>
+        <w:t>PostgreSQL enforces payments.order_id UNIQUE and UNIQUE (idempotency_key, request_path). V9 adds a payment foreign key, SHA-256 request fingerprint, response status, payment response reference, and 24-hour expiry metadata. Remaining lifecycle work is scheduled cleanup, retention metrics, and an optional immutable response snapshot.</w:t>
       </w:r>
     </w:p>
     <w:p>
@@ -2820,6 +2834,20 @@
         <w:rPr>
           <w:rFonts w:ascii="Arial Unicode MS" w:hAnsi="Arial Unicode MS" w:eastAsia="Arial Unicode MS" w:cs="Arial Unicode MS"/>
         </w:rPr>
+        <w:t>Legacy user collection/create routes require ADMIN; user detail/update/delete require the owner or ADMIN.</w:t>
+      </w:r>
+    </w:p>
+    <w:p>
+      <w:pPr>
+        <w:numPr>
+          <w:ilvl w:val="0"/>
+          <w:numId w:val="10"/>
+        </w:numPr>
+      </w:pPr>
+      <w:r>
+        <w:rPr>
+          <w:rFonts w:ascii="Arial Unicode MS" w:hAnsi="Arial Unicode MS" w:eastAsia="Arial Unicode MS" w:cs="Arial Unicode MS"/>
+        </w:rPr>
         <w:t>Cart routes authenticated and require path user ownership or ADMIN.</w:t>
       </w:r>
     </w:p>
@@ -2872,7 +2900,7 @@
         <w:ind w:left="202" w:right="144"/>
         <w:shd w:val="clear" w:color="auto" w:fill="F4F6F9"/>
         <w:pBdr>
-          <w:left w:val="single" w:sz="16" w:space="10" w:color="9B1C1C"/>
+          <w:left w:val="single" w:sz="16" w:space="10" w:color="2E7D4F"/>
         </w:pBdr>
       </w:pPr>
       <w:r>
@@ -2882,7 +2910,7 @@
           <w:color w:val="18324B"/>
           <w:sz w:val="21"/>
         </w:rPr>
-        <w:t xml:space="preserve">P0 Security finding  </w:t>
+        <w:t xml:space="preserve">Authorization boundary closed  </w:t>
       </w:r>
       <w:r>
         <w:rPr>
@@ -2890,7 +2918,7 @@
           <w:color w:val="18324B"/>
           <w:sz w:val="21"/>
         </w:rPr>
-        <w:t>Legacy /api/users/** CRUD currently falls through to anyRequest().permitAll(), allowing unauthenticated reads, updates, and deletion of user rows. Remove it before deployment or enforce explicit admin and self-service policies with privilege-escalation tests.</w:t>
+        <w:t>Anonymous and cross-user legacy user CRUD are denied, collection/create require ADMIN, item operations require owner or ADMIN, and unmatched routes use denyAll. Four integration tests exercise anonymous, self-service, cross-user, normal-user collection, and admin flows.</w:t>
       </w:r>
     </w:p>
     <w:p>
@@ -3868,7 +3896,7 @@
                 <w:color w:val="17212B"/>
                 <w:sz w:val="16"/>
               </w:rPr>
-              <w:t>Public*</w:t>
+              <w:t>ADMIN</w:t>
             </w:r>
           </w:p>
         </w:tc>
@@ -3950,7 +3978,7 @@
                 <w:color w:val="17212B"/>
                 <w:sz w:val="16"/>
               </w:rPr>
-              <w:t>Public*</w:t>
+              <w:t>ADMIN</w:t>
             </w:r>
           </w:p>
         </w:tc>
@@ -4032,7 +4060,7 @@
                 <w:color w:val="17212B"/>
                 <w:sz w:val="16"/>
               </w:rPr>
-              <w:t>Public*</w:t>
+              <w:t>Owner/admin</w:t>
             </w:r>
           </w:p>
         </w:tc>
@@ -4114,7 +4142,7 @@
                 <w:color w:val="17212B"/>
                 <w:sz w:val="16"/>
               </w:rPr>
-              <w:t>Public*</w:t>
+              <w:t>Owner/admin</w:t>
             </w:r>
           </w:p>
         </w:tc>
@@ -4196,7 +4224,7 @@
                 <w:color w:val="17212B"/>
                 <w:sz w:val="16"/>
               </w:rPr>
-              <w:t>Public*</w:t>
+              <w:t>Owner/admin</w:t>
             </w:r>
           </w:p>
         </w:tc>
@@ -5708,7 +5736,7 @@
         <w:pStyle w:val="SmallNote"/>
       </w:pPr>
       <w:r>
-        <w:t>* Public access to /api/users/** is a known P0 gap, not a recommended production policy.</w:t>
+        <w:t>Legacy user creation still overlaps registration, but access is explicit: collection/create routes are ADMIN-only, item routes are owner/admin, and unmatched routes are denied by default.</w:t>
       </w:r>
     </w:p>
     <w:p>
@@ -6234,7 +6262,7 @@
                 <w:color w:val="17212B"/>
                 <w:sz w:val="17"/>
               </w:rPr>
-              <w:t>HTTP result pointer</w:t>
+              <w:t>HTTP replay metadata</w:t>
             </w:r>
           </w:p>
         </w:tc>
@@ -6254,7 +6282,7 @@
                 <w:color w:val="17212B"/>
                 <w:sz w:val="17"/>
               </w:rPr>
-              <w:t>key + path non-unique index</w:t>
+              <w:t>key + path UNIQUE; payment FK</w:t>
             </w:r>
           </w:p>
         </w:tc>
@@ -6580,15 +6608,18 @@
         <w:rPr>
           <w:rFonts w:ascii="Arial Unicode MS" w:hAnsi="Arial Unicode MS" w:eastAsia="Arial Unicode MS" w:cs="Arial Unicode MS"/>
         </w:rPr>
-        <w:t>Flyway V1 through V8 create the commerce schema, outbox, processing lease, processed events, order audit, refresh tokens, session metadata, and authentication audit in sequence. Hibernate uses ddl-auto=validate and open-in-view=false, so schema drift fails fast at startup.</w:t>
+        <w:t>Flyway V1 through V9 create the commerce schema, outbox, processing lease, processed events, order audit, refresh tokens, session metadata, authentication audit, and payment-idempotency hardening in sequence. Hibernate uses ddl-auto=validate and open-in-view=false, so schema drift fails fast at startup.</w:t>
       </w:r>
     </w:p>
     <w:p>
+      <w:pPr>
+        <w:keepLines/>
+      </w:pPr>
       <w:r>
         <w:rPr>
           <w:rFonts w:ascii="Arial Unicode MS" w:hAnsi="Arial Unicode MS" w:eastAsia="Arial Unicode MS" w:cs="Arial Unicode MS"/>
         </w:rPr>
-        <w:t>Scheduled retention removes processed_events older than 30 days and order_event_audit rows older than 90 days. An integration test confirms that only rows beyond each cutoff are deleted. Idempotency records, authentication audit, published outbox events, and expired refresh tokens still need complete lifecycle policies.</w:t>
+        <w:t>Scheduled retention removes processed_events older than 30 days and order_event_audit rows older than 90 days. An integration test confirms that only rows beyond each cutoff are deleted. Idempotency records now carry a 24-hour expiry timestamp, but cleanup and response-snapshot policy remain; authentication audit, published outbox events, and expired refresh tokens also need complete lifecycle policies.</w:t>
       </w:r>
     </w:p>
     <w:p>
@@ -7774,7 +7805,7 @@
                 <w:color w:val="17212B"/>
                 <w:sz w:val="15"/>
               </w:rPr>
-              <w:t>4</w:t>
+              <w:t>7</w:t>
             </w:r>
           </w:p>
         </w:tc>
@@ -7814,7 +7845,7 @@
                 <w:color w:val="17212B"/>
                 <w:sz w:val="15"/>
               </w:rPr>
-              <w:t>Outbox, retry key, concurrent key</w:t>
+              <w:t>Replay, conflict, DB uniqueness, races</w:t>
             </w:r>
           </w:p>
         </w:tc>
@@ -7918,7 +7949,7 @@
                 <w:color w:val="17212B"/>
                 <w:sz w:val="15"/>
               </w:rPr>
-              <w:t>AuthAuditIntegrationTest</w:t>
+              <w:t>UserAuthorizationIntegrationTest</w:t>
             </w:r>
           </w:p>
         </w:tc>
@@ -7958,7 +7989,7 @@
                 <w:color w:val="17212B"/>
                 <w:sz w:val="15"/>
               </w:rPr>
-              <w:t>DB/Metrics</w:t>
+              <w:t>API/Security</w:t>
             </w:r>
           </w:p>
         </w:tc>
@@ -7978,7 +8009,7 @@
                 <w:color w:val="17212B"/>
                 <w:sz w:val="15"/>
               </w:rPr>
-              <w:t>Success/failure/session audit</w:t>
+              <w:t>Anonymous, self, cross-user, admin</w:t>
             </w:r>
           </w:p>
         </w:tc>
@@ -8000,7 +8031,7 @@
                 <w:color w:val="17212B"/>
                 <w:sz w:val="15"/>
               </w:rPr>
-              <w:t>EventRetentionCleanupIntegrationTest</w:t>
+              <w:t>AuthAuditIntegrationTest</w:t>
             </w:r>
           </w:p>
         </w:tc>
@@ -8020,7 +8051,7 @@
                 <w:color w:val="17212B"/>
                 <w:sz w:val="15"/>
               </w:rPr>
-              <w:t>1</w:t>
+              <w:t>4</w:t>
             </w:r>
           </w:p>
         </w:tc>
@@ -8040,7 +8071,7 @@
                 <w:color w:val="17212B"/>
                 <w:sz w:val="15"/>
               </w:rPr>
-              <w:t>DB</w:t>
+              <w:t>DB/Metrics</w:t>
             </w:r>
           </w:p>
         </w:tc>
@@ -8060,7 +8091,7 @@
                 <w:color w:val="17212B"/>
                 <w:sz w:val="15"/>
               </w:rPr>
-              <w:t>Expired-only deletion</w:t>
+              <w:t>Success/failure/session audit</w:t>
             </w:r>
           </w:p>
         </w:tc>
@@ -8082,7 +8113,7 @@
                 <w:color w:val="17212B"/>
                 <w:sz w:val="15"/>
               </w:rPr>
-              <w:t>KafkaConsumerIdempotencyIntegrationTest</w:t>
+              <w:t>EventRetentionCleanupIntegrationTest</w:t>
             </w:r>
           </w:p>
         </w:tc>
@@ -8122,7 +8153,7 @@
                 <w:color w:val="17212B"/>
                 <w:sz w:val="15"/>
               </w:rPr>
-              <w:t>Kafka/DB</w:t>
+              <w:t>DB</w:t>
             </w:r>
           </w:p>
         </w:tc>
@@ -8142,7 +8173,7 @@
                 <w:color w:val="17212B"/>
                 <w:sz w:val="15"/>
               </w:rPr>
-              <w:t>Duplicate -&gt; one audit</w:t>
+              <w:t>Expired-only deletion</w:t>
             </w:r>
           </w:p>
         </w:tc>
@@ -8164,7 +8195,7 @@
                 <w:color w:val="17212B"/>
                 <w:sz w:val="15"/>
               </w:rPr>
-              <w:t>KafkaRetryDltIntegrationTest</w:t>
+              <w:t>KafkaConsumerIdempotencyIntegrationTest</w:t>
             </w:r>
           </w:p>
         </w:tc>
@@ -8204,7 +8235,7 @@
                 <w:color w:val="17212B"/>
                 <w:sz w:val="15"/>
               </w:rPr>
-              <w:t>Kafka</w:t>
+              <w:t>Kafka/DB</w:t>
             </w:r>
           </w:p>
         </w:tc>
@@ -8224,7 +8255,7 @@
                 <w:color w:val="17212B"/>
                 <w:sz w:val="15"/>
               </w:rPr>
-              <w:t>Retry exhaustion -&gt; DLT</w:t>
+              <w:t>Duplicate -&gt; one audit</w:t>
             </w:r>
           </w:p>
         </w:tc>
@@ -8246,7 +8277,7 @@
                 <w:color w:val="17212B"/>
                 <w:sz w:val="15"/>
               </w:rPr>
-              <w:t>OutboxEventClaimServiceIntegrationTest</w:t>
+              <w:t>KafkaRetryDltIntegrationTest</w:t>
             </w:r>
           </w:p>
         </w:tc>
@@ -8266,7 +8297,7 @@
                 <w:color w:val="17212B"/>
                 <w:sz w:val="15"/>
               </w:rPr>
-              <w:t>3</w:t>
+              <w:t>1</w:t>
             </w:r>
           </w:p>
         </w:tc>
@@ -8286,7 +8317,7 @@
                 <w:color w:val="17212B"/>
                 <w:sz w:val="15"/>
               </w:rPr>
-              <w:t>Concurrency</w:t>
+              <w:t>Kafka</w:t>
             </w:r>
           </w:p>
         </w:tc>
@@ -8306,7 +8337,7 @@
                 <w:color w:val="17212B"/>
                 <w:sz w:val="15"/>
               </w:rPr>
-              <w:t>Claim distribution + lease</w:t>
+              <w:t>Retry exhaustion -&gt; DLT</w:t>
             </w:r>
           </w:p>
         </w:tc>
@@ -8328,7 +8359,7 @@
                 <w:color w:val="17212B"/>
                 <w:sz w:val="15"/>
               </w:rPr>
-              <w:t>OutboxEventPublisherIntegrationTest</w:t>
+              <w:t>OutboxEventClaimServiceIntegrationTest</w:t>
             </w:r>
           </w:p>
         </w:tc>
@@ -8348,7 +8379,7 @@
                 <w:color w:val="17212B"/>
                 <w:sz w:val="15"/>
               </w:rPr>
-              <w:t>1</w:t>
+              <w:t>3</w:t>
             </w:r>
           </w:p>
         </w:tc>
@@ -8368,7 +8399,7 @@
                 <w:color w:val="17212B"/>
                 <w:sz w:val="15"/>
               </w:rPr>
-              <w:t>Kafka/DB</w:t>
+              <w:t>Concurrency</w:t>
             </w:r>
           </w:p>
         </w:tc>
@@ -8388,7 +8419,7 @@
                 <w:color w:val="17212B"/>
                 <w:sz w:val="15"/>
               </w:rPr>
-              <w:t>PENDING -&gt; PUBLISHED</w:t>
+              <w:t>Claim distribution + lease</w:t>
             </w:r>
           </w:p>
         </w:tc>
@@ -8410,7 +8441,7 @@
                 <w:color w:val="17212B"/>
                 <w:sz w:val="15"/>
               </w:rPr>
-              <w:t>OutboxEventPublisherRetryIntegrationTest</w:t>
+              <w:t>OutboxEventPublisherIntegrationTest</w:t>
             </w:r>
           </w:p>
         </w:tc>
@@ -8430,7 +8461,7 @@
                 <w:color w:val="17212B"/>
                 <w:sz w:val="15"/>
               </w:rPr>
-              <w:t>2</w:t>
+              <w:t>1</w:t>
             </w:r>
           </w:p>
         </w:tc>
@@ -8450,7 +8481,7 @@
                 <w:color w:val="17212B"/>
                 <w:sz w:val="15"/>
               </w:rPr>
-              <w:t>Failure</w:t>
+              <w:t>Kafka/DB</w:t>
             </w:r>
           </w:p>
         </w:tc>
@@ -8470,7 +8501,7 @@
                 <w:color w:val="17212B"/>
                 <w:sz w:val="15"/>
               </w:rPr>
-              <w:t>Retry + terminal FAILED</w:t>
+              <w:t>PENDING -&gt; PUBLISHED</w:t>
             </w:r>
           </w:p>
         </w:tc>
@@ -8492,7 +8523,7 @@
                 <w:color w:val="17212B"/>
                 <w:sz w:val="15"/>
               </w:rPr>
-              <w:t>ProcessedEventServiceIntegrationTest</w:t>
+              <w:t>OutboxEventPublisherRetryIntegrationTest</w:t>
             </w:r>
           </w:p>
         </w:tc>
@@ -8532,7 +8563,7 @@
                 <w:color w:val="17212B"/>
                 <w:sz w:val="15"/>
               </w:rPr>
-              <w:t>DB</w:t>
+              <w:t>Failure</w:t>
             </w:r>
           </w:p>
         </w:tc>
@@ -8552,7 +8583,7 @@
                 <w:color w:val="17212B"/>
                 <w:sz w:val="15"/>
               </w:rPr>
-              <w:t>Dedup + rollback marker</w:t>
+              <w:t>Retry + terminal FAILED</w:t>
             </w:r>
           </w:p>
         </w:tc>
@@ -8574,7 +8605,7 @@
                 <w:color w:val="17212B"/>
                 <w:sz w:val="15"/>
               </w:rPr>
-              <w:t>ProductControllerTest</w:t>
+              <w:t>ProcessedEventServiceIntegrationTest</w:t>
             </w:r>
           </w:p>
         </w:tc>
@@ -8594,7 +8625,7 @@
                 <w:color w:val="17212B"/>
                 <w:sz w:val="15"/>
               </w:rPr>
-              <w:t>6</w:t>
+              <w:t>2</w:t>
             </w:r>
           </w:p>
         </w:tc>
@@ -8614,7 +8645,7 @@
                 <w:color w:val="17212B"/>
                 <w:sz w:val="15"/>
               </w:rPr>
-              <w:t>Component</w:t>
+              <w:t>DB</w:t>
             </w:r>
           </w:p>
         </w:tc>
@@ -8634,7 +8665,7 @@
                 <w:color w:val="17212B"/>
                 <w:sz w:val="15"/>
               </w:rPr>
-              <w:t>Response and sorting delegation</w:t>
+              <w:t>Dedup + rollback marker</w:t>
             </w:r>
           </w:p>
         </w:tc>
@@ -8656,7 +8687,7 @@
                 <w:color w:val="17212B"/>
                 <w:sz w:val="15"/>
               </w:rPr>
-              <w:t>GlobalExceptionHandlerTest</w:t>
+              <w:t>ProductControllerTest</w:t>
             </w:r>
           </w:p>
         </w:tc>
@@ -8676,7 +8707,7 @@
                 <w:color w:val="17212B"/>
                 <w:sz w:val="15"/>
               </w:rPr>
-              <w:t>5</w:t>
+              <w:t>6</w:t>
             </w:r>
           </w:p>
         </w:tc>
@@ -8716,7 +8747,7 @@
                 <w:color w:val="17212B"/>
                 <w:sz w:val="15"/>
               </w:rPr>
-              <w:t>Validation / 400 / 404 / 409</w:t>
+              <w:t>Response and sorting delegation</w:t>
             </w:r>
           </w:p>
         </w:tc>
@@ -8738,7 +8769,7 @@
                 <w:color w:val="17212B"/>
                 <w:sz w:val="15"/>
               </w:rPr>
-              <w:t>CartServiceTest</w:t>
+              <w:t>GlobalExceptionHandlerTest</w:t>
             </w:r>
           </w:p>
         </w:tc>
@@ -8758,7 +8789,7 @@
                 <w:color w:val="17212B"/>
                 <w:sz w:val="15"/>
               </w:rPr>
-              <w:t>13</w:t>
+              <w:t>5</w:t>
             </w:r>
           </w:p>
         </w:tc>
@@ -8778,7 +8809,7 @@
                 <w:color w:val="17212B"/>
                 <w:sz w:val="15"/>
               </w:rPr>
-              <w:t>Unit</w:t>
+              <w:t>Component</w:t>
             </w:r>
           </w:p>
         </w:tc>
@@ -8798,7 +8829,7 @@
                 <w:color w:val="17212B"/>
                 <w:sz w:val="15"/>
               </w:rPr>
-              <w:t>CRUD, ownership, stock, errors</w:t>
+              <w:t>Validation / 400 / 404 / 409</w:t>
             </w:r>
           </w:p>
         </w:tc>
@@ -8820,7 +8851,7 @@
                 <w:color w:val="17212B"/>
                 <w:sz w:val="15"/>
               </w:rPr>
-              <w:t>OrderServiceTest</w:t>
+              <w:t>CartServiceTest</w:t>
             </w:r>
           </w:p>
         </w:tc>
@@ -8840,7 +8871,7 @@
                 <w:color w:val="17212B"/>
                 <w:sz w:val="15"/>
               </w:rPr>
-              <w:t>9</w:t>
+              <w:t>13</w:t>
             </w:r>
           </w:p>
         </w:tc>
@@ -8880,7 +8911,7 @@
                 <w:color w:val="17212B"/>
                 <w:sz w:val="15"/>
               </w:rPr>
-              <w:t>Create, snapshot, stock, cancel</w:t>
+              <w:t>CRUD, ownership, stock, errors</w:t>
             </w:r>
           </w:p>
         </w:tc>
@@ -8902,7 +8933,7 @@
                 <w:color w:val="17212B"/>
                 <w:sz w:val="15"/>
               </w:rPr>
-              <w:t>OutboxEventPublisherTest</w:t>
+              <w:t>OrderServiceTest</w:t>
             </w:r>
           </w:p>
         </w:tc>
@@ -8922,7 +8953,7 @@
                 <w:color w:val="17212B"/>
                 <w:sz w:val="15"/>
               </w:rPr>
-              <w:t>5</w:t>
+              <w:t>9</w:t>
             </w:r>
           </w:p>
         </w:tc>
@@ -8962,7 +8993,7 @@
                 <w:color w:val="17212B"/>
                 <w:sz w:val="15"/>
               </w:rPr>
-              <w:t>Claim, publish, retry, failed</w:t>
+              <w:t>Create, snapshot, stock, cancel</w:t>
             </w:r>
           </w:p>
         </w:tc>
@@ -8984,7 +9015,7 @@
                 <w:color w:val="17212B"/>
                 <w:sz w:val="15"/>
               </w:rPr>
-              <w:t>OutboxMetricsTest</w:t>
+              <w:t>OutboxEventPublisherTest</w:t>
             </w:r>
           </w:p>
         </w:tc>
@@ -9004,7 +9035,7 @@
                 <w:color w:val="17212B"/>
                 <w:sz w:val="15"/>
               </w:rPr>
-              <w:t>3</w:t>
+              <w:t>5</w:t>
             </w:r>
           </w:p>
         </w:tc>
@@ -9044,7 +9075,7 @@
                 <w:color w:val="17212B"/>
                 <w:sz w:val="15"/>
               </w:rPr>
-              <w:t>Counters, guards, gauges</w:t>
+              <w:t>Claim, publish, retry, failed</w:t>
             </w:r>
           </w:p>
         </w:tc>
@@ -9066,7 +9097,7 @@
                 <w:color w:val="17212B"/>
                 <w:sz w:val="15"/>
               </w:rPr>
-              <w:t>PaymentServiceTest</w:t>
+              <w:t>OutboxMetricsTest</w:t>
             </w:r>
           </w:p>
         </w:tc>
@@ -9086,7 +9117,7 @@
                 <w:color w:val="17212B"/>
                 <w:sz w:val="15"/>
               </w:rPr>
-              <w:t>13</w:t>
+              <w:t>3</w:t>
             </w:r>
           </w:p>
         </w:tc>
@@ -9126,7 +9157,7 @@
                 <w:color w:val="17212B"/>
                 <w:sz w:val="15"/>
               </w:rPr>
-              <w:t>Idempotency and transaction paths</w:t>
+              <w:t>Counters, guards, gauges</w:t>
             </w:r>
           </w:p>
         </w:tc>
@@ -9148,7 +9179,7 @@
                 <w:color w:val="17212B"/>
                 <w:sz w:val="15"/>
               </w:rPr>
-              <w:t>ProductServiceTest</w:t>
+              <w:t>PaymentServiceTest</w:t>
             </w:r>
           </w:p>
         </w:tc>
@@ -9168,7 +9199,7 @@
                 <w:color w:val="17212B"/>
                 <w:sz w:val="15"/>
               </w:rPr>
-              <w:t>8</w:t>
+              <w:t>15</w:t>
             </w:r>
           </w:p>
         </w:tc>
@@ -9208,7 +9239,7 @@
                 <w:color w:val="17212B"/>
                 <w:sz w:val="15"/>
               </w:rPr>
-              <w:t>CRUD, pagination, errors</w:t>
+              <w:t>Fingerprint, key validation, transactions</w:t>
             </w:r>
           </w:p>
         </w:tc>
@@ -9230,6 +9261,88 @@
                 <w:color w:val="17212B"/>
                 <w:sz w:val="15"/>
               </w:rPr>
+              <w:t>ProductServiceTest</w:t>
+            </w:r>
+          </w:p>
+        </w:tc>
+        <w:tc>
+          <w:tcPr>
+            <w:tcW w:type="dxa" w:w="650"/>
+          </w:tcPr>
+          <w:p>
+            <w:pPr>
+              <w:spacing w:before="0" w:after="0" w:line="259" w:lineRule="auto"/>
+              <w:jc w:val="center"/>
+            </w:pPr>
+            <w:r>
+              <w:rPr>
+                <w:rFonts w:ascii="Arial Unicode MS" w:hAnsi="Arial Unicode MS" w:eastAsia="Arial Unicode MS" w:cs="Arial Unicode MS"/>
+                <w:b w:val="0"/>
+                <w:color w:val="17212B"/>
+                <w:sz w:val="15"/>
+              </w:rPr>
+              <w:t>8</w:t>
+            </w:r>
+          </w:p>
+        </w:tc>
+        <w:tc>
+          <w:tcPr>
+            <w:tcW w:type="dxa" w:w="1800"/>
+          </w:tcPr>
+          <w:p>
+            <w:pPr>
+              <w:spacing w:before="0" w:after="0" w:line="259" w:lineRule="auto"/>
+              <w:jc w:val="left"/>
+            </w:pPr>
+            <w:r>
+              <w:rPr>
+                <w:rFonts w:ascii="Arial Unicode MS" w:hAnsi="Arial Unicode MS" w:eastAsia="Arial Unicode MS" w:cs="Arial Unicode MS"/>
+                <w:b w:val="0"/>
+                <w:color w:val="17212B"/>
+                <w:sz w:val="15"/>
+              </w:rPr>
+              <w:t>Unit</w:t>
+            </w:r>
+          </w:p>
+        </w:tc>
+        <w:tc>
+          <w:tcPr>
+            <w:tcW w:type="dxa" w:w="3410"/>
+          </w:tcPr>
+          <w:p>
+            <w:pPr>
+              <w:spacing w:before="0" w:after="0" w:line="259" w:lineRule="auto"/>
+              <w:jc w:val="left"/>
+            </w:pPr>
+            <w:r>
+              <w:rPr>
+                <w:rFonts w:ascii="Arial Unicode MS" w:hAnsi="Arial Unicode MS" w:eastAsia="Arial Unicode MS" w:cs="Arial Unicode MS"/>
+                <w:b w:val="0"/>
+                <w:color w:val="17212B"/>
+                <w:sz w:val="15"/>
+              </w:rPr>
+              <w:t>CRUD, pagination, errors</w:t>
+            </w:r>
+          </w:p>
+        </w:tc>
+      </w:tr>
+      <w:tr>
+        <w:tc>
+          <w:tcPr>
+            <w:tcW w:type="dxa" w:w="3500"/>
+          </w:tcPr>
+          <w:p>
+            <w:pPr>
+              <w:spacing w:before="0" w:after="0" w:line="259" w:lineRule="auto"/>
+              <w:jc w:val="left"/>
+            </w:pPr>
+            <w:r>
+              <w:rPr>
+                <w:rFonts w:ascii="Arial Unicode MS" w:hAnsi="Arial Unicode MS" w:eastAsia="Arial Unicode MS" w:cs="Arial Unicode MS"/>
+                <w:b w:val="0"/>
+                <w:color w:val="17212B"/>
+                <w:sz w:val="15"/>
+              </w:rPr>
               <w:t>TOTAL</w:t>
             </w:r>
           </w:p>
@@ -9250,7 +9363,7 @@
                 <w:color w:val="17212B"/>
                 <w:sz w:val="15"/>
               </w:rPr>
-              <w:t>104</w:t>
+              <w:t>113</w:t>
             </w:r>
           </w:p>
         </w:tc>
@@ -9270,7 +9383,7 @@
                 <w:color w:val="17212B"/>
                 <w:sz w:val="15"/>
               </w:rPr>
-              <w:t>62 unit/component + 42 integration</w:t>
+              <w:t>64 unit/component + 49 integration</w:t>
             </w:r>
           </w:p>
         </w:tc>
@@ -9290,7 +9403,7 @@
                 <w:color w:val="17212B"/>
                 <w:sz w:val="15"/>
               </w:rPr>
-              <w:t>104 passed; 0 failed/error/skipped</w:t>
+              <w:t>113 passed; 0 failed/error/skipped</w:t>
             </w:r>
           </w:p>
         </w:tc>
@@ -9498,7 +9611,7 @@
                 <w:color w:val="17212B"/>
                 <w:sz w:val="18"/>
               </w:rPr>
-              <w:t>5,102</w:t>
+              <w:t>5,638</w:t>
             </w:r>
           </w:p>
         </w:tc>
@@ -9518,7 +9631,7 @@
                 <w:color w:val="17212B"/>
                 <w:sz w:val="18"/>
               </w:rPr>
-              <w:t>1,160</w:t>
+              <w:t>825</w:t>
             </w:r>
           </w:p>
         </w:tc>
@@ -9538,7 +9651,7 @@
                 <w:color w:val="17212B"/>
                 <w:sz w:val="18"/>
               </w:rPr>
-              <w:t>6,262</w:t>
+              <w:t>6,463</w:t>
             </w:r>
           </w:p>
         </w:tc>
@@ -9558,7 +9671,7 @@
                 <w:color w:val="17212B"/>
                 <w:sz w:val="18"/>
               </w:rPr>
-              <w:t>81.48%</w:t>
+              <w:t>87.24%</w:t>
             </w:r>
           </w:p>
         </w:tc>
@@ -9600,7 +9713,7 @@
                 <w:color w:val="17212B"/>
                 <w:sz w:val="18"/>
               </w:rPr>
-              <w:t>112</w:t>
+              <w:t>120</w:t>
             </w:r>
           </w:p>
         </w:tc>
@@ -9620,7 +9733,7 @@
                 <w:color w:val="17212B"/>
                 <w:sz w:val="18"/>
               </w:rPr>
-              <w:t>52</w:t>
+              <w:t>48</w:t>
             </w:r>
           </w:p>
         </w:tc>
@@ -9640,7 +9753,7 @@
                 <w:color w:val="17212B"/>
                 <w:sz w:val="18"/>
               </w:rPr>
-              <w:t>164</w:t>
+              <w:t>168</w:t>
             </w:r>
           </w:p>
         </w:tc>
@@ -9660,7 +9773,7 @@
                 <w:color w:val="17212B"/>
                 <w:sz w:val="18"/>
               </w:rPr>
-              <w:t>68.29%</w:t>
+              <w:t>71.43%</w:t>
             </w:r>
           </w:p>
         </w:tc>
@@ -9702,7 +9815,7 @@
                 <w:color w:val="17212B"/>
                 <w:sz w:val="18"/>
               </w:rPr>
-              <w:t>1,399</w:t>
+              <w:t>1,541</w:t>
             </w:r>
           </w:p>
         </w:tc>
@@ -9722,7 +9835,7 @@
                 <w:color w:val="17212B"/>
                 <w:sz w:val="18"/>
               </w:rPr>
-              <w:t>331</w:t>
+              <w:t>239</w:t>
             </w:r>
           </w:p>
         </w:tc>
@@ -9742,7 +9855,7 @@
                 <w:color w:val="17212B"/>
                 <w:sz w:val="18"/>
               </w:rPr>
-              <w:t>1,730</w:t>
+              <w:t>1,780</w:t>
             </w:r>
           </w:p>
         </w:tc>
@@ -9762,7 +9875,7 @@
                 <w:color w:val="17212B"/>
                 <w:sz w:val="18"/>
               </w:rPr>
-              <w:t>80.87%</w:t>
+              <w:t>86.57%</w:t>
             </w:r>
           </w:p>
         </w:tc>
@@ -9804,7 +9917,7 @@
                 <w:color w:val="17212B"/>
                 <w:sz w:val="18"/>
               </w:rPr>
-              <w:t>466</w:t>
+              <w:t>516</w:t>
             </w:r>
           </w:p>
         </w:tc>
@@ -9824,7 +9937,7 @@
                 <w:color w:val="17212B"/>
                 <w:sz w:val="18"/>
               </w:rPr>
-              <w:t>158</w:t>
+              <w:t>121</w:t>
             </w:r>
           </w:p>
         </w:tc>
@@ -9844,7 +9957,7 @@
                 <w:color w:val="17212B"/>
                 <w:sz w:val="18"/>
               </w:rPr>
-              <w:t>624</w:t>
+              <w:t>637</w:t>
             </w:r>
           </w:p>
         </w:tc>
@@ -9864,7 +9977,7 @@
                 <w:color w:val="17212B"/>
                 <w:sz w:val="18"/>
               </w:rPr>
-              <w:t>74.68%</w:t>
+              <w:t>81.00%</w:t>
             </w:r>
           </w:p>
         </w:tc>
@@ -9906,7 +10019,7 @@
                 <w:color w:val="17212B"/>
                 <w:sz w:val="18"/>
               </w:rPr>
-              <w:t>426</w:t>
+              <w:t>472</w:t>
             </w:r>
           </w:p>
         </w:tc>
@@ -9926,7 +10039,7 @@
                 <w:color w:val="17212B"/>
                 <w:sz w:val="18"/>
               </w:rPr>
-              <w:t>116</w:t>
+              <w:t>81</w:t>
             </w:r>
           </w:p>
         </w:tc>
@@ -9946,7 +10059,7 @@
                 <w:color w:val="17212B"/>
                 <w:sz w:val="18"/>
               </w:rPr>
-              <w:t>542</w:t>
+              <w:t>553</w:t>
             </w:r>
           </w:p>
         </w:tc>
@@ -9966,7 +10079,7 @@
                 <w:color w:val="17212B"/>
                 <w:sz w:val="18"/>
               </w:rPr>
-              <w:t>78.60%</w:t>
+              <w:t>85.35%</w:t>
             </w:r>
           </w:p>
         </w:tc>
@@ -10008,7 +10121,7 @@
                 <w:color w:val="17212B"/>
                 <w:sz w:val="18"/>
               </w:rPr>
-              <w:t>84</w:t>
+              <w:t>90</w:t>
             </w:r>
           </w:p>
         </w:tc>
@@ -10028,7 +10141,7 @@
                 <w:color w:val="17212B"/>
                 <w:sz w:val="18"/>
               </w:rPr>
-              <w:t>6</w:t>
+              <w:t>2</w:t>
             </w:r>
           </w:p>
         </w:tc>
@@ -10048,7 +10161,7 @@
                 <w:color w:val="17212B"/>
                 <w:sz w:val="18"/>
               </w:rPr>
-              <w:t>90</w:t>
+              <w:t>92</w:t>
             </w:r>
           </w:p>
         </w:tc>
@@ -10068,7 +10181,7 @@
                 <w:color w:val="17212B"/>
                 <w:sz w:val="18"/>
               </w:rPr>
-              <w:t>93.33%</w:t>
+              <w:t>97.83%</w:t>
             </w:r>
           </w:p>
         </w:tc>
@@ -11514,89 +11627,6 @@
                 <w:color w:val="17212B"/>
                 <w:sz w:val="16"/>
               </w:rPr>
-              <w:t>Public legacy user CRUD</w:t>
-            </w:r>
-          </w:p>
-        </w:tc>
-        <w:tc>
-          <w:tcPr>
-            <w:tcW w:type="dxa" w:w="2600"/>
-          </w:tcPr>
-          <w:p>
-            <w:pPr>
-              <w:spacing w:before="0" w:after="0" w:line="259" w:lineRule="auto"/>
-              <w:jc w:val="left"/>
-            </w:pPr>
-            <w:r>
-              <w:rPr>
-                <w:rFonts w:ascii="Arial Unicode MS" w:hAnsi="Arial Unicode MS" w:eastAsia="Arial Unicode MS" w:cs="Arial Unicode MS"/>
-                <w:b w:val="0"/>
-                <w:color w:val="17212B"/>
-                <w:sz w:val="16"/>
-              </w:rPr>
-              <w:t>Unauthorized read/update/delete</w:t>
-            </w:r>
-          </w:p>
-        </w:tc>
-        <w:tc>
-          <w:tcPr>
-            <w:tcW w:type="dxa" w:w="3260"/>
-          </w:tcPr>
-          <w:p>
-            <w:pPr>
-              <w:spacing w:before="0" w:after="0" w:line="259" w:lineRule="auto"/>
-              <w:jc w:val="left"/>
-            </w:pPr>
-            <w:r>
-              <w:rPr>
-                <w:rFonts w:ascii="Arial Unicode MS" w:hAnsi="Arial Unicode MS" w:eastAsia="Arial Unicode MS" w:cs="Arial Unicode MS"/>
-                <w:b w:val="0"/>
-                <w:color w:val="17212B"/>
-                <w:sz w:val="16"/>
-              </w:rPr>
-              <w:t>Remove or enforce admin/self policy + tests</w:t>
-            </w:r>
-          </w:p>
-        </w:tc>
-      </w:tr>
-      <w:tr>
-        <w:tc>
-          <w:tcPr>
-            <w:tcW w:type="dxa" w:w="1000"/>
-            <w:shd w:val="clear" w:color="auto" w:fill="FCECEC"/>
-          </w:tcPr>
-          <w:p>
-            <w:pPr>
-              <w:spacing w:before="0" w:after="0" w:line="259" w:lineRule="auto"/>
-              <w:jc w:val="left"/>
-            </w:pPr>
-            <w:r>
-              <w:rPr>
-                <w:rFonts w:ascii="Arial Unicode MS" w:hAnsi="Arial Unicode MS" w:eastAsia="Arial Unicode MS" w:cs="Arial Unicode MS"/>
-                <w:b/>
-                <w:color w:val="9B1C1C"/>
-                <w:sz w:val="16"/>
-              </w:rPr>
-              <w:t>P0</w:t>
-            </w:r>
-          </w:p>
-        </w:tc>
-        <w:tc>
-          <w:tcPr>
-            <w:tcW w:type="dxa" w:w="2500"/>
-          </w:tcPr>
-          <w:p>
-            <w:pPr>
-              <w:spacing w:before="0" w:after="0" w:line="259" w:lineRule="auto"/>
-              <w:jc w:val="center"/>
-            </w:pPr>
-            <w:r>
-              <w:rPr>
-                <w:rFonts w:ascii="Arial Unicode MS" w:hAnsi="Arial Unicode MS" w:eastAsia="Arial Unicode MS" w:cs="Arial Unicode MS"/>
-                <w:b w:val="0"/>
-                <w:color w:val="17212B"/>
-                <w:sz w:val="16"/>
-              </w:rPr>
               <w:t>Env/file-based secrets</w:t>
             </w:r>
           </w:p>
@@ -11680,7 +11710,7 @@
                 <w:color w:val="17212B"/>
                 <w:sz w:val="16"/>
               </w:rPr>
-              <w:t>Non-unique idempotency key/path</w:t>
+              <w:t>Idempotency cleanup/snapshot policy</w:t>
             </w:r>
           </w:p>
         </w:tc>
@@ -11700,7 +11730,7 @@
                 <w:color w:val="17212B"/>
                 <w:sz w:val="16"/>
               </w:rPr>
-              <w:t>Ambiguous general retry semantics</w:t>
+              <w:t>Expired rows / evolving reconstruction</w:t>
             </w:r>
           </w:p>
         </w:tc>
@@ -11720,7 +11750,7 @@
                 <w:color w:val="17212B"/>
                 <w:sz w:val="16"/>
               </w:rPr>
-              <w:t>Unique key, fingerprint, response snapshot</w:t>
+              <w:t>Cleanup, retention metrics, optional snapshot</w:t>
             </w:r>
           </w:p>
         </w:tc>
@@ -12550,7 +12580,7 @@
         <w:rPr>
           <w:rFonts w:ascii="Arial Unicode MS" w:hAnsi="Arial Unicode MS" w:eastAsia="Arial Unicode MS" w:cs="Arial Unicode MS"/>
         </w:rPr>
-        <w:t>Payment idempotency uses a database lock, transaction, unique payment invariant, and concurrent verification rather than only accepting a header.</w:t>
+        <w:t>Payment idempotency uses a database lock, two unique invariants, a request fingerprint, replay metadata, and same-key and terminal-transition concurrency verification.</w:t>
       </w:r>
     </w:p>
     <w:p>
@@ -12650,7 +12680,7 @@
         <w:pStyle w:val="Heading2"/>
       </w:pPr>
       <w:r>
-        <w:t>Phase 1 — Security and correctness closure</w:t>
+        <w:t>Phase 1 — Remaining correctness cleanup</w:t>
       </w:r>
     </w:p>
     <w:p>
@@ -12664,7 +12694,7 @@
         <w:rPr>
           <w:rFonts w:ascii="Arial Unicode MS" w:hAnsi="Arial Unicode MS" w:eastAsia="Arial Unicode MS" w:cs="Arial Unicode MS"/>
         </w:rPr>
-        <w:t>Fix or remove the /api/users legacy CRUD authorization gap.</w:t>
+        <w:t>Add idempotency expiry cleanup, retention metrics, and an optional immutable response snapshot.</w:t>
       </w:r>
     </w:p>
     <w:p>
@@ -12678,7 +12708,7 @@
         <w:rPr>
           <w:rFonts w:ascii="Arial Unicode MS" w:hAnsi="Arial Unicode MS" w:eastAsia="Arial Unicode MS" w:cs="Arial Unicode MS"/>
         </w:rPr>
-        <w:t>Add an idempotency unique constraint, request fingerprint, response snapshot, expiry, and retention.</w:t>
+        <w:t>Remove or isolate the educational slow-order endpoint.</w:t>
       </w:r>
     </w:p>
     <w:p>
@@ -12692,7 +12722,7 @@
         <w:rPr>
           <w:rFonts w:ascii="Arial Unicode MS" w:hAnsi="Arial Unicode MS" w:eastAsia="Arial Unicode MS" w:cs="Arial Unicode MS"/>
         </w:rPr>
-        <w:t>Add cancel-versus-pay concurrency and state-transition tests.</w:t>
+        <w:t>Define trusted-proxy handling before honoring forwarded client addresses.</w:t>
       </w:r>
     </w:p>
     <w:p>
@@ -12878,7 +12908,7 @@
         <w:pStyle w:val="Lead"/>
       </w:pPr>
       <w:r>
-        <w:t>Verified evidence: 104 of 104 tests passed; instruction coverage is 81.48%; branch coverage is 68.29%; the Maven coverage gate and regression baseline both passed. Known boundaries: public legacy user API, single-host topology, simulated payment, DLT operations gap, and unverified cloud deployment.</w:t>
+        <w:t>Verified evidence: 113 of 113 tests passed; instruction coverage is 87.24%; branch coverage is 71.43%; the Maven coverage gate and regression baseline both passed. Known boundaries: idempotency cleanup policy, single-host topology, simulated payment, DLT operations gap, and unverified cloud deployment.</w:t>
       </w:r>
     </w:p>
     <w:sectPr>

</xml_diff>

<commit_message>
docs: refresh project documentation after Phase 2.1 verification
</commit_message>
<xml_diff>
--- a/System_Design_and_Engineering_Portfolio.docx
+++ b/System_Design_and_Engineering_Portfolio.docx
@@ -70,6 +70,7 @@
       <w:tr>
         <w:trPr>
           <w:cantSplit/>
+          <w:tblHeader w:val="true"/>
         </w:trPr>
         <w:tc>
           <w:tcPr>
@@ -335,6 +336,7 @@
     <w:p>
       <w:pPr>
         <w:pStyle w:val="Heading1"/>
+        <w:keepNext/>
       </w:pPr>
       <w:r>
         <w:t>Reader's Guide</w:t>
@@ -480,6 +482,7 @@
     <w:p>
       <w:pPr>
         <w:pStyle w:val="Heading1"/>
+        <w:keepNext/>
       </w:pPr>
       <w:r>
         <w:t>1. Executive Summary</w:t>
@@ -490,12 +493,7 @@
         <w:spacing w:after="100" w:line="259" w:lineRule="auto"/>
       </w:pPr>
       <w:r>
-        <w:rPr>
-          <w:rFonts w:ascii="Aptos" w:hAnsi="Aptos" w:eastAsia="Aptos"/>
-          <w:color w:val="1F2933"/>
-          <w:sz w:val="20"/>
-        </w:rPr>
-        <w:t>This production-minded Spring Boot backend combines secure identity, commerce transactions, a Transactional Outbox, scheduled Kafka retry, idempotent consumers, governed dead-letter recovery, cross-boundary correlation, metrics, traces, structured logs, SLOs, runbooks, and executable recovery drills.</w:t>
+        <w:t>This portfolio evaluates a production-minded Spring Boot backend as an integrated reliability system: secure identity and commerce transactions feed a Transactional Outbox, scheduled Kafka retry, idempotent consumers, governed dead-letter recovery, cross-boundary correlation, metrics, traces, structured logs, SLOs, runbooks, and executable recovery drills.</w:t>
       </w:r>
     </w:p>
     <w:p>
@@ -672,6 +670,7 @@
     <w:p>
       <w:pPr>
         <w:pStyle w:val="Heading1"/>
+        <w:keepNext/>
       </w:pPr>
       <w:r>
         <w:t>2. Verified Engineering Baseline</w:t>
@@ -680,6 +679,7 @@
     <w:p>
       <w:pPr>
         <w:pStyle w:val="TableCaption"/>
+        <w:keepNext/>
       </w:pPr>
       <w:r>
         <w:t>Table 1 | Verified baseline on 2026-08-07</w:t>
@@ -1491,13 +1491,15 @@
       </w:pPr>
     </w:p>
     <w:p>
-      <w:r>
-        <w:br w:type="page"/>
-      </w:r>
+      <w:pPr>
+        <w:spacing w:after="0"/>
+      </w:pPr>
+      <w:r/>
     </w:p>
     <w:p>
       <w:pPr>
         <w:pStyle w:val="Heading1"/>
+        <w:keepNext/>
       </w:pPr>
       <w:r>
         <w:t>3. Distributed-System Scope and Architecture</w:t>
@@ -1505,6 +1507,7 @@
     </w:p>
     <w:p>
       <w:pPr>
+        <w:keepNext/>
         <w:spacing w:after="80"/>
         <w:jc w:val="center"/>
       </w:pPr>
@@ -1512,7 +1515,7 @@
         <w:drawing>
           <wp:inline xmlns:a="http://schemas.openxmlformats.org/drawingml/2006/main" xmlns:pic="http://schemas.openxmlformats.org/drawingml/2006/picture">
             <wp:extent cx="6492240" cy="3787140"/>
-            <wp:docPr id="1" name="Picture 1"/>
+            <wp:docPr id="1" name="Figure 1: Current deployment architecture" title="Current deployment architecture" descr="Caddy routes HTTP to the Spring Boot application. The application accesses PostgreSQL and Redis, publishes and consumes Kafka messages, emits telemetry to the observability stack, and is verified and delivered through tests, CI, CodeQL, Docker Compose, and runbooks."/>
             <wp:cNvGraphicFramePr>
               <a:graphicFrameLocks noChangeAspect="1"/>
             </wp:cNvGraphicFramePr>
@@ -1545,17 +1548,15 @@
     </w:p>
     <w:p>
       <w:pPr>
+        <w:keepNext w:val="0"/>
         <w:spacing w:after="140"/>
         <w:jc w:val="center"/>
       </w:pPr>
       <w:r>
         <w:rPr>
-          <w:rFonts w:ascii="Aptos" w:hAnsi="Aptos" w:eastAsia="Aptos"/>
           <w:i/>
-          <w:color w:val="5D6770"/>
-          <w:sz w:val="18"/>
         </w:rPr>
-        <w:t>Figure 1 | Current system context: separate networked services on one Docker host</w:t>
+        <w:t>Figure 1 | Request, state, messaging, observability, and verification boundaries on one Docker host</w:t>
       </w:r>
     </w:p>
     <w:p>
@@ -1574,6 +1575,7 @@
     <w:p>
       <w:pPr>
         <w:pStyle w:val="TableCaption"/>
+        <w:keepNext/>
       </w:pPr>
       <w:r>
         <w:t>Table 2 | Current topology and boundary</w:t>
@@ -2231,13 +2233,15 @@
       </w:pPr>
     </w:p>
     <w:p>
-      <w:r>
-        <w:br w:type="page"/>
-      </w:r>
+      <w:pPr>
+        <w:spacing w:after="0"/>
+      </w:pPr>
+      <w:r/>
     </w:p>
     <w:p>
       <w:pPr>
         <w:pStyle w:val="Heading1"/>
+        <w:keepNext/>
       </w:pPr>
       <w:r>
         <w:t>4. Domain Transactions and Invariants</w:t>
@@ -2246,6 +2250,7 @@
     <w:p>
       <w:pPr>
         <w:pStyle w:val="Heading2"/>
+        <w:keepNext/>
       </w:pPr>
       <w:r>
         <w:t>4.1 Product, Cart, and Order</w:t>
@@ -2338,6 +2343,7 @@
     <w:p>
       <w:pPr>
         <w:pStyle w:val="Heading2"/>
+        <w:keepNext/>
       </w:pPr>
       <w:r>
         <w:t>4.2 Payment Idempotency</w:t>
@@ -2507,13 +2513,15 @@
       </w:pPr>
     </w:p>
     <w:p>
-      <w:r>
-        <w:br w:type="page"/>
-      </w:r>
+      <w:pPr>
+        <w:spacing w:after="0"/>
+      </w:pPr>
+      <w:r/>
     </w:p>
     <w:p>
       <w:pPr>
         <w:pStyle w:val="Heading1"/>
+        <w:keepNext/>
       </w:pPr>
       <w:r>
         <w:t>5. Transactional Outbox and Scheduled Kafka Retry</w:t>
@@ -2521,6 +2529,7 @@
     </w:p>
     <w:p>
       <w:pPr>
+        <w:keepNext/>
         <w:spacing w:after="80"/>
         <w:jc w:val="center"/>
       </w:pPr>
@@ -2528,7 +2537,7 @@
         <w:drawing>
           <wp:inline xmlns:a="http://schemas.openxmlformats.org/drawingml/2006/main" xmlns:pic="http://schemas.openxmlformats.org/drawingml/2006/picture">
             <wp:extent cx="5394960" cy="3147060"/>
-            <wp:docPr id="2" name="Picture 2"/>
+            <wp:docPr id="2" name="Figure 2: Transactional Outbox retry lifecycle" title="Transactional Outbox retry lifecycle" descr="PENDING events move to PROCESSING. Kafka acknowledgement moves them to PUBLISHED. Send failure schedules retry and returns them to PENDING when next_attempt_at is due. Expired processing leases return to PENDING. Maximum attempts move an event to FAILED, and ADMIN replay returns it to PENDING."/>
             <wp:cNvGraphicFramePr>
               <a:graphicFrameLocks noChangeAspect="1"/>
             </wp:cNvGraphicFramePr>
@@ -2561,22 +2570,21 @@
     </w:p>
     <w:p>
       <w:pPr>
+        <w:keepNext w:val="0"/>
         <w:spacing w:after="140"/>
         <w:jc w:val="center"/>
       </w:pPr>
       <w:r>
         <w:rPr>
-          <w:rFonts w:ascii="Aptos" w:hAnsi="Aptos" w:eastAsia="Aptos"/>
           <w:i/>
-          <w:color w:val="5D6770"/>
-          <w:sz w:val="18"/>
         </w:rPr>
-        <w:t>Figure 2 | Durable Outbox state, scheduled retry, processing lease, and terminal failure</w:t>
+        <w:t>Figure 2 | Due-time eligibility, lease recovery, scheduled retry, terminal failure, and ADMIN replay</w:t>
       </w:r>
     </w:p>
     <w:p>
       <w:pPr>
         <w:pStyle w:val="Heading2"/>
+        <w:keepNext/>
       </w:pPr>
       <w:r>
         <w:t>5.1 Producer-Side Reliability</w:t>
@@ -2683,6 +2691,7 @@
     <w:p>
       <w:pPr>
         <w:pStyle w:val="Heading2"/>
+        <w:keepNext/>
       </w:pPr>
       <w:r>
         <w:t>5.2 Retry Scheduling</w:t>
@@ -3062,6 +3071,7 @@
     <w:p>
       <w:pPr>
         <w:pStyle w:val="Heading1"/>
+        <w:keepNext/>
       </w:pPr>
       <w:r>
         <w:t>6. Kafka Consumer Safety and Governed DLT Operations</w:t>
@@ -3070,6 +3080,7 @@
     <w:p>
       <w:pPr>
         <w:pStyle w:val="Heading2"/>
+        <w:keepNext/>
       </w:pPr>
       <w:r>
         <w:t>6.1 Consumer Idempotency</w:t>
@@ -3154,6 +3165,7 @@
     <w:p>
       <w:pPr>
         <w:pStyle w:val="Heading2"/>
+        <w:keepNext/>
       </w:pPr>
       <w:r>
         <w:t>6.2 Persisted Dead-Letter Lifecycle</w:t>
@@ -3161,6 +3173,7 @@
     </w:p>
     <w:p>
       <w:pPr>
+        <w:keepNext/>
         <w:spacing w:after="80"/>
         <w:jc w:val="center"/>
       </w:pPr>
@@ -3168,7 +3181,7 @@
         <w:drawing>
           <wp:inline xmlns:a="http://schemas.openxmlformats.org/drawingml/2006/main" xmlns:pic="http://schemas.openxmlformats.org/drawingml/2006/picture">
             <wp:extent cx="6492240" cy="3426460"/>
-            <wp:docPr id="3" name="Picture 3"/>
+            <wp:docPr id="3" name="Figure 3: Governed dead-letter lifecycle" title="Governed dead-letter lifecycle" descr="Dead-letter evidence moves from RECEIVED to QUARANTINED, REPLAYING, and REPLAYED. Kafka send failure or an expired 60-second replay lease returns REPLAYING evidence to QUARANTINED."/>
             <wp:cNvGraphicFramePr>
               <a:graphicFrameLocks noChangeAspect="1"/>
             </wp:cNvGraphicFramePr>
@@ -3201,17 +3214,15 @@
     </w:p>
     <w:p>
       <w:pPr>
+        <w:keepNext w:val="0"/>
         <w:spacing w:after="140"/>
         <w:jc w:val="center"/>
       </w:pPr>
       <w:r>
         <w:rPr>
-          <w:rFonts w:ascii="Aptos" w:hAnsi="Aptos" w:eastAsia="Aptos"/>
           <w:i/>
-          <w:color w:val="5D6770"/>
-          <w:sz w:val="18"/>
         </w:rPr>
-        <w:t>Figure 3 | Persisted DLT evidence, quarantine, replay reservation, recovery, and operator audit</w:t>
+        <w:t>Figure 3 | Persisted DLT evidence, quarantine, replay reservation, failure recovery, and operator audit</w:t>
       </w:r>
     </w:p>
     <w:p>
@@ -3305,6 +3316,7 @@
     <w:p>
       <w:pPr>
         <w:pStyle w:val="Heading1"/>
+        <w:keepNext/>
       </w:pPr>
       <w:r>
         <w:t>7. Security and Session Lifecycle</w:t>
@@ -3313,6 +3325,7 @@
     <w:p>
       <w:pPr>
         <w:pStyle w:val="TableCaption"/>
+        <w:keepNext/>
       </w:pPr>
       <w:r>
         <w:t>Table 3 | Identity and authorization controls</w:t>
@@ -4081,6 +4094,7 @@
     <w:p>
       <w:pPr>
         <w:pStyle w:val="Heading2"/>
+        <w:keepNext/>
       </w:pPr>
       <w:r>
         <w:t>7.1 Authorization Boundary</w:t>
@@ -4187,6 +4201,7 @@
     <w:p>
       <w:pPr>
         <w:pStyle w:val="Heading2"/>
+        <w:keepNext/>
       </w:pPr>
       <w:r>
         <w:t>7.2 Remaining Security Work</w:t>
@@ -4263,13 +4278,15 @@
       </w:r>
     </w:p>
     <w:p>
-      <w:r>
-        <w:br w:type="page"/>
-      </w:r>
+      <w:pPr>
+        <w:spacing w:after="0"/>
+      </w:pPr>
+      <w:r/>
     </w:p>
     <w:p>
       <w:pPr>
         <w:pStyle w:val="Heading1"/>
+        <w:keepNext/>
       </w:pPr>
       <w:r>
         <w:t>8. Data Model and Schema Evolution</w:t>
@@ -4278,6 +4295,7 @@
     <w:p>
       <w:pPr>
         <w:pStyle w:val="TableCaption"/>
+        <w:keepNext/>
       </w:pPr>
       <w:r>
         <w:t>Table 4 | Core tables and invariants</w:t>
@@ -5289,6 +5307,7 @@
     <w:p>
       <w:pPr>
         <w:pStyle w:val="Heading2"/>
+        <w:keepNext/>
       </w:pPr>
       <w:r>
         <w:t>8.1 Flyway V1-V11</w:t>
@@ -5459,13 +5478,15 @@
       </w:r>
     </w:p>
     <w:p>
-      <w:r>
-        <w:br w:type="page"/>
-      </w:r>
+      <w:pPr>
+        <w:spacing w:after="0"/>
+      </w:pPr>
+      <w:r/>
     </w:p>
     <w:p>
       <w:pPr>
         <w:pStyle w:val="Heading1"/>
+        <w:keepNext/>
       </w:pPr>
       <w:r>
         <w:t>9. Correlation, Observability, SLOs, and Runbooks</w:t>
@@ -5474,6 +5495,7 @@
     <w:p>
       <w:pPr>
         <w:pStyle w:val="TableCaption"/>
+        <w:keepNext/>
       </w:pPr>
       <w:r>
         <w:t>Table 5 | Signals and operational response</w:t>
@@ -6335,6 +6357,7 @@
     <w:p>
       <w:pPr>
         <w:pStyle w:val="TableCaption"/>
+        <w:keepNext/>
       </w:pPr>
       <w:r>
         <w:t>Table 6 | Service objectives</w:t>
@@ -6788,13 +6811,15 @@
       </w:r>
     </w:p>
     <w:p>
-      <w:r>
-        <w:br w:type="page"/>
-      </w:r>
+      <w:pPr>
+        <w:spacing w:after="0"/>
+      </w:pPr>
+      <w:r/>
     </w:p>
     <w:p>
       <w:pPr>
         <w:pStyle w:val="Heading1"/>
+        <w:keepNext/>
       </w:pPr>
       <w:r>
         <w:t>10. Executed Reliability and Recovery Drills</w:t>
@@ -6803,6 +6828,7 @@
     <w:p>
       <w:pPr>
         <w:pStyle w:val="TableCaption"/>
+        <w:keepNext/>
       </w:pPr>
       <w:r>
         <w:t>Table 7 | Phase 2.1 operational verification</w:t>
@@ -7499,13 +7525,15 @@
       </w:r>
     </w:p>
     <w:p>
-      <w:r>
-        <w:br w:type="page"/>
-      </w:r>
+      <w:pPr>
+        <w:spacing w:after="0"/>
+      </w:pPr>
+      <w:r/>
     </w:p>
     <w:p>
       <w:pPr>
         <w:pStyle w:val="Heading1"/>
+        <w:keepNext/>
       </w:pPr>
       <w:r>
         <w:t>11. Testing and Quality Evidence</w:t>
@@ -7527,6 +7555,7 @@
     <w:p>
       <w:pPr>
         <w:pStyle w:val="TableCaption"/>
+        <w:keepNext/>
       </w:pPr>
       <w:r>
         <w:t>Table 8 | Representative automated test areas</w:t>
@@ -8117,6 +8146,7 @@
     <w:p>
       <w:pPr>
         <w:pStyle w:val="TableCaption"/>
+        <w:keepNext/>
       </w:pPr>
       <w:r>
         <w:t>Table 9 | Current JaCoCo and build baseline</w:t>
@@ -8647,13 +8677,15 @@
       </w:pPr>
     </w:p>
     <w:p>
-      <w:r>
-        <w:br w:type="page"/>
-      </w:r>
+      <w:pPr>
+        <w:spacing w:after="0"/>
+      </w:pPr>
+      <w:r/>
     </w:p>
     <w:p>
       <w:pPr>
         <w:pStyle w:val="Heading1"/>
+        <w:keepNext/>
       </w:pPr>
       <w:r>
         <w:t>12. Performance and Concurrency Evidence</w:t>
@@ -8662,6 +8694,7 @@
     <w:p>
       <w:pPr>
         <w:pStyle w:val="Heading2"/>
+        <w:keepNext/>
       </w:pPr>
       <w:r>
         <w:t>12.1 Catalog Read Baseline</w:t>
@@ -9028,6 +9061,7 @@
     <w:p>
       <w:pPr>
         <w:pStyle w:val="Heading2"/>
+        <w:keepNext/>
       </w:pPr>
       <w:r>
         <w:t>12.2 High-Rate Local Soak</w:t>
@@ -9451,6 +9485,7 @@
     <w:p>
       <w:pPr>
         <w:pStyle w:val="Heading2"/>
+        <w:keepNext/>
       </w:pPr>
       <w:r>
         <w:t>12.3 Payment Idempotency Profile</w:t>
@@ -9869,13 +9904,15 @@
       </w:pPr>
     </w:p>
     <w:p>
-      <w:r>
-        <w:br w:type="page"/>
-      </w:r>
+      <w:pPr>
+        <w:spacing w:after="0"/>
+      </w:pPr>
+      <w:r/>
     </w:p>
     <w:p>
       <w:pPr>
         <w:pStyle w:val="Heading1"/>
+        <w:keepNext/>
       </w:pPr>
       <w:r>
         <w:t>13. Delivery and Repository Governance</w:t>
@@ -9884,6 +9921,7 @@
     <w:p>
       <w:pPr>
         <w:pStyle w:val="TableCaption"/>
+        <w:keepNext/>
       </w:pPr>
       <w:r>
         <w:t>Table 10 | Delivery controls and boundaries</w:t>
@@ -10743,13 +10781,15 @@
       </w:r>
     </w:p>
     <w:p>
-      <w:r>
-        <w:br w:type="page"/>
-      </w:r>
+      <w:pPr>
+        <w:spacing w:after="0"/>
+      </w:pPr>
+      <w:r/>
     </w:p>
     <w:p>
       <w:pPr>
         <w:pStyle w:val="Heading1"/>
+        <w:keepNext/>
       </w:pPr>
       <w:r>
         <w:t>14. Engineering Risk Register and Production Boundary</w:t>
@@ -10758,6 +10798,7 @@
     <w:p>
       <w:pPr>
         <w:pStyle w:val="TableCaption"/>
+        <w:keepNext/>
       </w:pPr>
       <w:r>
         <w:t>Table 11 | Prioritized remaining work</w:t>
@@ -11617,13 +11658,15 @@
       </w:r>
     </w:p>
     <w:p>
-      <w:r>
-        <w:br w:type="page"/>
-      </w:r>
+      <w:pPr>
+        <w:spacing w:after="0"/>
+      </w:pPr>
+      <w:r/>
     </w:p>
     <w:p>
       <w:pPr>
         <w:pStyle w:val="Heading1"/>
+        <w:keepNext/>
       </w:pPr>
       <w:r>
         <w:t>15. Professional Evaluation</w:t>
@@ -11634,12 +11677,7 @@
         <w:spacing w:after="100" w:line="259" w:lineRule="auto"/>
       </w:pPr>
       <w:r>
-        <w:rPr>
-          <w:rFonts w:ascii="Aptos" w:hAnsi="Aptos" w:eastAsia="Aptos"/>
-          <w:color w:val="1F2933"/>
-          <w:sz w:val="20"/>
-        </w:rPr>
-        <w:t>The project's strongest contribution is the integration of reliability mechanisms that are often demonstrated separately, with state, tests, metrics, audit, or drill evidence supporting each important claim.</w:t>
+        <w:t>From a senior engineering review perspective, the project's strongest contribution is the integration of reliability mechanisms that are often demonstrated separately. Important claims are supported by durable state, automated tests, metrics, audit history, or executed drill evidence.</w:t>
       </w:r>
     </w:p>
     <w:p>
@@ -11756,20 +11794,12 @@
             </w:pPr>
             <w:r>
               <w:rPr>
-                <w:rFonts w:ascii="Aptos" w:hAnsi="Aptos" w:eastAsia="Aptos"/>
                 <w:b/>
-                <w:color w:val="234A67"/>
-                <w:sz w:val="20"/>
               </w:rPr>
               <w:t xml:space="preserve">Portfolio conclusion  </w:t>
             </w:r>
             <w:r>
-              <w:rPr>
-                <w:rFonts w:ascii="Aptos" w:hAnsi="Aptos" w:eastAsia="Aptos"/>
-                <w:color w:val="1F2933"/>
-                <w:sz w:val="20"/>
-              </w:rPr>
-              <w:t>Strong evidence for backend, Java, platform, DevOps/SRE, and event-driven systems internships or junior roles. It demonstrates distributed-systems reasoning and recovery engineering, but does not replace experience operating a multi-node commercial service.</w:t>
+              <w:t>Strong evidence for backend, Java, platform, DevOps/SRE, and event-driven systems internships or junior roles. The judgment is grounded in implemented invariants and executed recovery evidence; it does not replace experience operating a multi-node commercial service.</w:t>
             </w:r>
           </w:p>
         </w:tc>
@@ -11781,13 +11811,15 @@
       </w:pPr>
     </w:p>
     <w:p>
-      <w:r>
-        <w:br w:type="page"/>
-      </w:r>
+      <w:pPr>
+        <w:spacing w:after="0"/>
+      </w:pPr>
+      <w:r/>
     </w:p>
     <w:p>
       <w:pPr>
         <w:pStyle w:val="Heading1"/>
+        <w:keepNext/>
       </w:pPr>
       <w:r>
         <w:t>16. Prioritized Roadmap</w:t>
@@ -11796,6 +11828,7 @@
     <w:p>
       <w:pPr>
         <w:pStyle w:val="Heading2"/>
+        <w:keepNext/>
       </w:pPr>
       <w:r>
         <w:t>Completed: Phase 1 - P0 Hardening</w:t>
@@ -11874,6 +11907,7 @@
     <w:p>
       <w:pPr>
         <w:pStyle w:val="Heading2"/>
+        <w:keepNext/>
       </w:pPr>
       <w:r>
         <w:t>Completed: Phase 2 and Phase 2.1</w:t>
@@ -11952,6 +11986,7 @@
     <w:p>
       <w:pPr>
         <w:pStyle w:val="Heading2"/>
+        <w:keepNext/>
       </w:pPr>
       <w:r>
         <w:t>Next: Phase 3 - Cloud-Native and Highly Available Delivery</w:t>
@@ -12042,13 +12077,15 @@
       </w:r>
     </w:p>
     <w:p>
-      <w:r>
-        <w:br w:type="page"/>
-      </w:r>
+      <w:pPr>
+        <w:spacing w:after="0"/>
+      </w:pPr>
+      <w:r/>
     </w:p>
     <w:p>
       <w:pPr>
         <w:pStyle w:val="Heading1"/>
+        <w:keepNext/>
       </w:pPr>
       <w:r>
         <w:t>Final Positioning Statement</w:t>
@@ -12113,12 +12150,7 @@
         <w:spacing w:after="100" w:line="259" w:lineRule="auto"/>
       </w:pPr>
       <w:r>
-        <w:rPr>
-          <w:rFonts w:ascii="Aptos" w:hAnsi="Aptos" w:eastAsia="Aptos"/>
-          <w:color w:val="1F2933"/>
-          <w:sz w:val="20"/>
-        </w:rPr>
-        <w:t>Verified evidence: 146 of 146 tests passed; instruction coverage is 89.78%; branch coverage is 73.63%; the Maven gate and regression baseline passed; Flyway V1-V11 was validated; Kafka outage, backlog recovery, failed-login, and PostgreSQL backup/restore drills passed; PR #27 was merged and release tag v1.3.0-phase21-reliability was published.</w:t>
+        <w:t>Verified evidence: 146 of 146 tests passed; instruction coverage is 89.78%; branch coverage is 73.63%; the Maven gate and regression baseline passed; Flyway V1-V11 was validated; Kafka outage, backlog recovery, failed-login, and PostgreSQL backup/restore drills passed; PR #27 was merged; and release tag v1.3.0-phase21-reliability was published.</w:t>
       </w:r>
     </w:p>
     <w:p>
@@ -12126,12 +12158,7 @@
         <w:spacing w:after="100" w:line="259" w:lineRule="auto"/>
       </w:pPr>
       <w:r>
-        <w:rPr>
-          <w:rFonts w:ascii="Aptos" w:hAnsi="Aptos" w:eastAsia="Aptos"/>
-          <w:color w:val="1F2933"/>
-          <w:sz w:val="20"/>
-        </w:rPr>
-        <w:t>Known boundaries: single-host topology, one application instance, one Kafka broker, single-node PostgreSQL and Redis, simulated payment provider, incomplete managed-secret and retention lifecycle, no verified cloud deployment, and no long-running production traffic.</w:t>
+        <w:t>Known boundaries remain explicit: single-host topology, one application instance, one Kafka broker, single-node PostgreSQL and Redis, a simulated payment provider, incomplete managed-secret and retention lifecycle, no verified cloud deployment, and no long-running production traffic.</w:t>
       </w:r>
     </w:p>
     <w:sectPr>

</xml_diff>

<commit_message>
docs: update engineering portfolio to current verified baseline
</commit_message>
<xml_diff>
--- a/System_Design_and_Engineering_Portfolio.docx
+++ b/System_Design_and_Engineering_Portfolio.docx
@@ -101,7 +101,7 @@
                 <w:color w:val="2E74B5"/>
                 <w:sz w:val="40"/>
               </w:rPr>
-              <w:t>146</w:t>
+              <w:t>172</w:t>
             </w:r>
           </w:p>
         </w:tc>
@@ -130,7 +130,7 @@
                 <w:color w:val="2E74B5"/>
                 <w:sz w:val="40"/>
               </w:rPr>
-              <w:t>89.54%</w:t>
+              <w:t>92.55%</w:t>
             </w:r>
           </w:p>
         </w:tc>
@@ -159,7 +159,7 @@
                 <w:color w:val="2E74B5"/>
                 <w:sz w:val="40"/>
               </w:rPr>
-              <w:t>73.63%</w:t>
+              <w:t>82.75%</w:t>
             </w:r>
           </w:p>
         </w:tc>
@@ -306,7 +306,7 @@
                 <w:color w:val="526579"/>
                 <w:sz w:val="15"/>
               </w:rPr>
-              <w:t>CURRENT MILESTONE</w:t>
+              <w:t>VERIFIED MILESTONE</w:t>
             </w:r>
           </w:p>
         </w:tc>
@@ -365,7 +365,7 @@
           <w:color w:val="1F2D3D"/>
           <w:sz w:val="18"/>
         </w:rPr>
-        <w:t>At main 67d2cf9, an independent clean-clone `mvn clean verify` rerun on 2026-08-10 completed successfully: 146 tests passed, 0 failed, 0 errors, 0 skipped; JaCoCo measured 89.54% instruction and 73.63% branch coverage across 111 analyzed classes.</w:t>
+        <w:t>At main ff5e527, clean-clone ./mvnw clean verify passed on 2026-08-10: 172 tests, 0 failures, 0 errors, 0 skipped; JaCoCo measured 92.55% instruction and 82.75% branch coverage across 112 classes; the 85% / 75% hard gate passed.</w:t>
       </w:r>
     </w:p>
     <w:tbl>
@@ -546,7 +546,7 @@
           <w:color w:val="1F2D3D"/>
           <w:sz w:val="18"/>
         </w:rPr>
-        <w:t>HEAD and origin/main both resolve to 67d2cf9. Source, configuration, infrastructure, and verification paths are clean; README, engineering summary, and portfolio are actively edited documentation artifacts in the inspected working tree.</w:t>
+        <w:t>The clean verification clone resolves to ff5e527261fd3ccdf3098151375c13264f5afef2. Phase 8 documentation and OCI milestones remain immutably tagged at 929bee0 and ed626cb; current test figures were regenerated from main rather than copied from those snapshots.</w:t>
       </w:r>
     </w:p>
     <w:p>
@@ -1354,7 +1354,7 @@
                 <w:color w:val="1F2D3D"/>
                 <w:sz w:val="16"/>
               </w:rPr>
-              <w:t>main = origin/main = 67d2cf9; Phase 8 tag → ed626cb</w:t>
+              <w:t>main = origin/main = ff5e527; docs tag 929bee0; OCI tag ed626cb</w:t>
             </w:r>
           </w:p>
         </w:tc>
@@ -1383,7 +1383,7 @@
                 <w:color w:val="1F2D3D"/>
                 <w:sz w:val="16"/>
               </w:rPr>
-              <w:t>Code/config clean; documentation work in progress</w:t>
+              <w:t>Clean verification clone at the full current SHA</w:t>
             </w:r>
           </w:p>
         </w:tc>
@@ -1446,7 +1446,7 @@
                 <w:color w:val="1F2D3D"/>
                 <w:sz w:val="16"/>
               </w:rPr>
-              <w:t>2026-08-10 clean verify: 146 passed / 0 failed / 0 errors / 0 skipped</w:t>
+              <w:t>2026-08-10 clean verify: 172 passed / 0 failed / 0 errors / 0 skipped</w:t>
             </w:r>
           </w:p>
         </w:tc>
@@ -1538,7 +1538,7 @@
                 <w:color w:val="1F2D3D"/>
                 <w:sz w:val="16"/>
               </w:rPr>
-              <w:t>89.54% instruction / 73.63% branch; 111 classes analyzed</w:t>
+              <w:t>92.55% instruction / 82.75% branch; 112 classes analyzed</w:t>
             </w:r>
           </w:p>
         </w:tc>
@@ -1567,7 +1567,7 @@
                 <w:color w:val="1F2D3D"/>
                 <w:sz w:val="16"/>
               </w:rPr>
-              <w:t>Current rerun; distinct from the CI floor</w:t>
+              <w:t>Current rerun; Maven hard gate 85% / 75% passed</w:t>
             </w:r>
           </w:p>
         </w:tc>
@@ -2247,7 +2247,7 @@
           <w:color w:val="1F2D3D"/>
           <w:sz w:val="18"/>
         </w:rPr>
-        <w:t>Current rerun = 89.54% / 73.63%. Historical Phase 2.1 snapshot = 89.78% / 73.63%. CI regression floor = 81.4756% / 68.2927% with a 0.5 percentage-point maximum drop. These are three different facts and are not presented as one number.</w:t>
+        <w:t>Current rerun = 92.55% / 82.75%. Historical Phase 2.1 snapshot = 89.78% / 73.63%. Maven hard gate = 85% / 75%. The secondary regression reference remains 81.4756% / 68.2927% with a 0.5 percentage-point maximum drop. These are distinct facts.</w:t>
       </w:r>
     </w:p>
     <w:p>
@@ -3220,6 +3220,23 @@
           <w:sz w:val="19"/>
         </w:rPr>
         <w:t>Idempotency-Key + request path identify the command; SHA-256 fingerprinting rejects key reuse with a different payload.</w:t>
+      </w:r>
+    </w:p>
+    <w:p>
+      <w:pPr>
+        <w:numPr>
+          <w:ilvl w:val="0"/>
+          <w:numId w:val="10"/>
+        </w:numPr>
+        <w:spacing w:after="40" w:line="252" w:lineRule="auto"/>
+      </w:pPr>
+      <w:r>
+        <w:rPr>
+          <w:rFonts w:ascii="Arial" w:hAnsi="Arial" w:eastAsia="Arial" w:cs="Arial"/>
+          <w:color w:val="1F2D3D"/>
+          <w:sz w:val="19"/>
+        </w:rPr>
+        <w:t>Production exposes one checkout workflow: the slow endpoint, duplicated implementation, and Thread.sleep were removed; timing control is isolated behind a no-op production delay port.</w:t>
       </w:r>
     </w:p>
     <w:tbl>
@@ -5526,7 +5543,7 @@
                 <w:color w:val="1F2D3D"/>
                 <w:sz w:val="15"/>
               </w:rPr>
-              <w:t>146/0/0/0; 49.896s build; 111 classes</w:t>
+              <w:t>172/0/0/0; 49.278s build; 112 classes</w:t>
             </w:r>
           </w:p>
         </w:tc>
@@ -5555,7 +5572,7 @@
                 <w:color w:val="1F2D3D"/>
                 <w:sz w:val="15"/>
               </w:rPr>
-              <w:t>Direct rerun on main, 2026-08-10</w:t>
+              <w:t>Direct rerun at ff5e527, 2026-08-10</w:t>
             </w:r>
           </w:p>
         </w:tc>
@@ -6196,7 +6213,7 @@
                 <w:color w:val="1F2D3D"/>
                 <w:sz w:val="16"/>
               </w:rPr>
-              <w:t>89.54%</w:t>
+              <w:t>92.55%</w:t>
             </w:r>
           </w:p>
         </w:tc>
@@ -6225,7 +6242,7 @@
                 <w:color w:val="1F2D3D"/>
                 <w:sz w:val="16"/>
               </w:rPr>
-              <w:t>73.63%</w:t>
+              <w:t>82.75%</w:t>
             </w:r>
           </w:p>
         </w:tc>
@@ -6409,7 +6426,7 @@
                 <w:color w:val="1F2D3D"/>
                 <w:sz w:val="16"/>
               </w:rPr>
-              <w:t>CI regression floor</w:t>
+              <w:t>Maven hard gate</w:t>
             </w:r>
           </w:p>
         </w:tc>
@@ -6438,7 +6455,7 @@
                 <w:color w:val="1F2D3D"/>
                 <w:sz w:val="16"/>
               </w:rPr>
-              <w:t>81.4756%</w:t>
+              <w:t>85.00%</w:t>
             </w:r>
           </w:p>
         </w:tc>
@@ -6467,7 +6484,7 @@
                 <w:color w:val="1F2D3D"/>
                 <w:sz w:val="16"/>
               </w:rPr>
-              <w:t>68.2927%</w:t>
+              <w:t>75.00%</w:t>
             </w:r>
           </w:p>
         </w:tc>
@@ -6496,7 +6513,128 @@
                 <w:color w:val="1F2D3D"/>
                 <w:sz w:val="16"/>
               </w:rPr>
-              <w:t>Baseline gate with maximum drop 0.005</w:t>
+              <w:t>Bundle minimum enforced during verify; current run passed</w:t>
+            </w:r>
+          </w:p>
+        </w:tc>
+      </w:tr>
+      <w:tr>
+        <w:trPr>
+          <w:cantSplit/>
+        </w:trPr>
+        <w:tc>
+          <w:tcPr>
+            <w:tcW w:type="dxa" w:w="2600"/>
+            <w:shd w:fill="F5F8FB" w:val="clear"/>
+            <w:vAlign w:val="center"/>
+            <w:tcMar>
+              <w:top w:w="80" w:type="dxa"/>
+              <w:start w:w="120" w:type="dxa"/>
+              <w:bottom w:w="80" w:type="dxa"/>
+              <w:end w:w="120" w:type="dxa"/>
+            </w:tcMar>
+          </w:tcPr>
+          <w:p>
+            <w:pPr>
+              <w:spacing w:before="0" w:after="0" w:line="254" w:lineRule="auto"/>
+              <w:jc w:val="left"/>
+            </w:pPr>
+            <w:r/>
+            <w:r>
+              <w:rPr>
+                <w:rFonts w:ascii="Arial" w:hAnsi="Arial" w:eastAsia="Arial" w:cs="Arial"/>
+                <w:b w:val="0"/>
+                <w:color w:val="1F2D3D"/>
+                <w:sz w:val="16"/>
+              </w:rPr>
+              <w:t>Regression reference</w:t>
+            </w:r>
+          </w:p>
+        </w:tc>
+        <w:tc>
+          <w:tcPr>
+            <w:tcW w:type="dxa" w:w="1300"/>
+            <w:shd w:fill="F5F8FB" w:val="clear"/>
+            <w:vAlign w:val="center"/>
+            <w:tcMar>
+              <w:top w:w="80" w:type="dxa"/>
+              <w:start w:w="120" w:type="dxa"/>
+              <w:bottom w:w="80" w:type="dxa"/>
+              <w:end w:w="120" w:type="dxa"/>
+            </w:tcMar>
+          </w:tcPr>
+          <w:p>
+            <w:pPr>
+              <w:spacing w:before="0" w:after="0" w:line="254" w:lineRule="auto"/>
+              <w:jc w:val="center"/>
+            </w:pPr>
+            <w:r/>
+            <w:r>
+              <w:rPr>
+                <w:rFonts w:ascii="Arial" w:hAnsi="Arial" w:eastAsia="Arial" w:cs="Arial"/>
+                <w:b w:val="0"/>
+                <w:color w:val="1F2D3D"/>
+                <w:sz w:val="16"/>
+              </w:rPr>
+              <w:t>81.4756%</w:t>
+            </w:r>
+          </w:p>
+        </w:tc>
+        <w:tc>
+          <w:tcPr>
+            <w:tcW w:type="dxa" w:w="1300"/>
+            <w:shd w:fill="F5F8FB" w:val="clear"/>
+            <w:vAlign w:val="center"/>
+            <w:tcMar>
+              <w:top w:w="80" w:type="dxa"/>
+              <w:start w:w="120" w:type="dxa"/>
+              <w:bottom w:w="80" w:type="dxa"/>
+              <w:end w:w="120" w:type="dxa"/>
+            </w:tcMar>
+          </w:tcPr>
+          <w:p>
+            <w:pPr>
+              <w:spacing w:before="0" w:after="0" w:line="254" w:lineRule="auto"/>
+              <w:jc w:val="center"/>
+            </w:pPr>
+            <w:r/>
+            <w:r>
+              <w:rPr>
+                <w:rFonts w:ascii="Arial" w:hAnsi="Arial" w:eastAsia="Arial" w:cs="Arial"/>
+                <w:b w:val="0"/>
+                <w:color w:val="1F2D3D"/>
+                <w:sz w:val="16"/>
+              </w:rPr>
+              <w:t>68.2927%</w:t>
+            </w:r>
+          </w:p>
+        </w:tc>
+        <w:tc>
+          <w:tcPr>
+            <w:tcW w:type="dxa" w:w="4160"/>
+            <w:shd w:fill="F5F8FB" w:val="clear"/>
+            <w:vAlign w:val="center"/>
+            <w:tcMar>
+              <w:top w:w="80" w:type="dxa"/>
+              <w:start w:w="120" w:type="dxa"/>
+              <w:bottom w:w="80" w:type="dxa"/>
+              <w:end w:w="120" w:type="dxa"/>
+            </w:tcMar>
+          </w:tcPr>
+          <w:p>
+            <w:pPr>
+              <w:spacing w:before="0" w:after="0" w:line="254" w:lineRule="auto"/>
+              <w:jc w:val="left"/>
+            </w:pPr>
+            <w:r/>
+            <w:r>
+              <w:rPr>
+                <w:rFonts w:ascii="Arial" w:hAnsi="Arial" w:eastAsia="Arial" w:cs="Arial"/>
+                <w:b w:val="0"/>
+                <w:color w:val="1F2D3D"/>
+                <w:sz w:val="16"/>
+              </w:rPr>
+              <w:t>Secondary baseline; maximum absolute drop 0.005</w:t>
             </w:r>
           </w:p>
         </w:tc>
@@ -7910,7 +8048,7 @@
                 <w:color w:val="1F2D3D"/>
                 <w:sz w:val="15"/>
               </w:rPr>
-              <w:t>pom.xml; target reports from clean rerun</w:t>
+              <w:t>pom.xml; verification/phase8/*; clean rerun</w:t>
             </w:r>
           </w:p>
         </w:tc>
@@ -7939,7 +8077,7 @@
                 <w:color w:val="1F2D3D"/>
                 <w:sz w:val="15"/>
               </w:rPr>
-              <w:t>146 tests; 89.54% instruction; 73.63% branch</w:t>
+              <w:t>172 tests; 92.55% instruction; 82.75% branch</w:t>
             </w:r>
           </w:p>
         </w:tc>
@@ -8844,7 +8982,7 @@
         <w:color w:val="6B7C8F"/>
         <w:sz w:val="17"/>
       </w:rPr>
-      <w:t>RAVAN CHUANG  ·  VERIFIED 2026-08-10  ·  MAIN 67d2cf9</w:t>
+      <w:t>RAVAN CHUANG  ·  VERIFIED 2026-08-10  ·  MAIN ff5e527</w:t>
     </w:r>
   </w:p>
 </w:ftr>

</xml_diff>

<commit_message>
docs: update engineering portfolio to current verified baseline (#47)
</commit_message>
<xml_diff>
--- a/System_Design_and_Engineering_Portfolio.docx
+++ b/System_Design_and_Engineering_Portfolio.docx
@@ -101,7 +101,7 @@
                 <w:color w:val="2E74B5"/>
                 <w:sz w:val="40"/>
               </w:rPr>
-              <w:t>146</w:t>
+              <w:t>172</w:t>
             </w:r>
           </w:p>
         </w:tc>
@@ -130,7 +130,7 @@
                 <w:color w:val="2E74B5"/>
                 <w:sz w:val="40"/>
               </w:rPr>
-              <w:t>89.54%</w:t>
+              <w:t>92.55%</w:t>
             </w:r>
           </w:p>
         </w:tc>
@@ -159,7 +159,7 @@
                 <w:color w:val="2E74B5"/>
                 <w:sz w:val="40"/>
               </w:rPr>
-              <w:t>73.63%</w:t>
+              <w:t>82.75%</w:t>
             </w:r>
           </w:p>
         </w:tc>
@@ -306,7 +306,7 @@
                 <w:color w:val="526579"/>
                 <w:sz w:val="15"/>
               </w:rPr>
-              <w:t>CURRENT MILESTONE</w:t>
+              <w:t>VERIFIED MILESTONE</w:t>
             </w:r>
           </w:p>
         </w:tc>
@@ -365,7 +365,7 @@
           <w:color w:val="1F2D3D"/>
           <w:sz w:val="18"/>
         </w:rPr>
-        <w:t>At main 67d2cf9, an independent clean-clone `mvn clean verify` rerun on 2026-08-10 completed successfully: 146 tests passed, 0 failed, 0 errors, 0 skipped; JaCoCo measured 89.54% instruction and 73.63% branch coverage across 111 analyzed classes.</w:t>
+        <w:t>At main ff5e527, clean-clone ./mvnw clean verify passed on 2026-08-10: 172 tests, 0 failures, 0 errors, 0 skipped; JaCoCo measured 92.55% instruction and 82.75% branch coverage across 112 classes; the 85% / 75% hard gate passed.</w:t>
       </w:r>
     </w:p>
     <w:tbl>
@@ -546,7 +546,7 @@
           <w:color w:val="1F2D3D"/>
           <w:sz w:val="18"/>
         </w:rPr>
-        <w:t>HEAD and origin/main both resolve to 67d2cf9. Source, configuration, infrastructure, and verification paths are clean; README, engineering summary, and portfolio are actively edited documentation artifacts in the inspected working tree.</w:t>
+        <w:t>The clean verification clone resolves to ff5e527261fd3ccdf3098151375c13264f5afef2. Phase 8 documentation and OCI milestones remain immutably tagged at 929bee0 and ed626cb; current test figures were regenerated from main rather than copied from those snapshots.</w:t>
       </w:r>
     </w:p>
     <w:p>
@@ -1354,7 +1354,7 @@
                 <w:color w:val="1F2D3D"/>
                 <w:sz w:val="16"/>
               </w:rPr>
-              <w:t>main = origin/main = 67d2cf9; Phase 8 tag → ed626cb</w:t>
+              <w:t>main = origin/main = ff5e527; docs tag 929bee0; OCI tag ed626cb</w:t>
             </w:r>
           </w:p>
         </w:tc>
@@ -1383,7 +1383,7 @@
                 <w:color w:val="1F2D3D"/>
                 <w:sz w:val="16"/>
               </w:rPr>
-              <w:t>Code/config clean; documentation work in progress</w:t>
+              <w:t>Clean verification clone at the full current SHA</w:t>
             </w:r>
           </w:p>
         </w:tc>
@@ -1446,7 +1446,7 @@
                 <w:color w:val="1F2D3D"/>
                 <w:sz w:val="16"/>
               </w:rPr>
-              <w:t>2026-08-10 clean verify: 146 passed / 0 failed / 0 errors / 0 skipped</w:t>
+              <w:t>2026-08-10 clean verify: 172 passed / 0 failed / 0 errors / 0 skipped</w:t>
             </w:r>
           </w:p>
         </w:tc>
@@ -1538,7 +1538,7 @@
                 <w:color w:val="1F2D3D"/>
                 <w:sz w:val="16"/>
               </w:rPr>
-              <w:t>89.54% instruction / 73.63% branch; 111 classes analyzed</w:t>
+              <w:t>92.55% instruction / 82.75% branch; 112 classes analyzed</w:t>
             </w:r>
           </w:p>
         </w:tc>
@@ -1567,7 +1567,7 @@
                 <w:color w:val="1F2D3D"/>
                 <w:sz w:val="16"/>
               </w:rPr>
-              <w:t>Current rerun; distinct from the CI floor</w:t>
+              <w:t>Current rerun; Maven hard gate 85% / 75% passed</w:t>
             </w:r>
           </w:p>
         </w:tc>
@@ -2247,7 +2247,7 @@
           <w:color w:val="1F2D3D"/>
           <w:sz w:val="18"/>
         </w:rPr>
-        <w:t>Current rerun = 89.54% / 73.63%. Historical Phase 2.1 snapshot = 89.78% / 73.63%. CI regression floor = 81.4756% / 68.2927% with a 0.5 percentage-point maximum drop. These are three different facts and are not presented as one number.</w:t>
+        <w:t>Current rerun = 92.55% / 82.75%. Historical Phase 2.1 snapshot = 89.78% / 73.63%. Maven hard gate = 85% / 75%. The secondary regression reference remains 81.4756% / 68.2927% with a 0.5 percentage-point maximum drop. These are distinct facts.</w:t>
       </w:r>
     </w:p>
     <w:p>
@@ -3220,6 +3220,23 @@
           <w:sz w:val="19"/>
         </w:rPr>
         <w:t>Idempotency-Key + request path identify the command; SHA-256 fingerprinting rejects key reuse with a different payload.</w:t>
+      </w:r>
+    </w:p>
+    <w:p>
+      <w:pPr>
+        <w:numPr>
+          <w:ilvl w:val="0"/>
+          <w:numId w:val="10"/>
+        </w:numPr>
+        <w:spacing w:after="40" w:line="252" w:lineRule="auto"/>
+      </w:pPr>
+      <w:r>
+        <w:rPr>
+          <w:rFonts w:ascii="Arial" w:hAnsi="Arial" w:eastAsia="Arial" w:cs="Arial"/>
+          <w:color w:val="1F2D3D"/>
+          <w:sz w:val="19"/>
+        </w:rPr>
+        <w:t>Production exposes one checkout workflow: the slow endpoint, duplicated implementation, and Thread.sleep were removed; timing control is isolated behind a no-op production delay port.</w:t>
       </w:r>
     </w:p>
     <w:tbl>
@@ -5526,7 +5543,7 @@
                 <w:color w:val="1F2D3D"/>
                 <w:sz w:val="15"/>
               </w:rPr>
-              <w:t>146/0/0/0; 49.896s build; 111 classes</w:t>
+              <w:t>172/0/0/0; 49.278s build; 112 classes</w:t>
             </w:r>
           </w:p>
         </w:tc>
@@ -5555,7 +5572,7 @@
                 <w:color w:val="1F2D3D"/>
                 <w:sz w:val="15"/>
               </w:rPr>
-              <w:t>Direct rerun on main, 2026-08-10</w:t>
+              <w:t>Direct rerun at ff5e527, 2026-08-10</w:t>
             </w:r>
           </w:p>
         </w:tc>
@@ -6196,7 +6213,7 @@
                 <w:color w:val="1F2D3D"/>
                 <w:sz w:val="16"/>
               </w:rPr>
-              <w:t>89.54%</w:t>
+              <w:t>92.55%</w:t>
             </w:r>
           </w:p>
         </w:tc>
@@ -6225,7 +6242,7 @@
                 <w:color w:val="1F2D3D"/>
                 <w:sz w:val="16"/>
               </w:rPr>
-              <w:t>73.63%</w:t>
+              <w:t>82.75%</w:t>
             </w:r>
           </w:p>
         </w:tc>
@@ -6409,7 +6426,7 @@
                 <w:color w:val="1F2D3D"/>
                 <w:sz w:val="16"/>
               </w:rPr>
-              <w:t>CI regression floor</w:t>
+              <w:t>Maven hard gate</w:t>
             </w:r>
           </w:p>
         </w:tc>
@@ -6438,7 +6455,7 @@
                 <w:color w:val="1F2D3D"/>
                 <w:sz w:val="16"/>
               </w:rPr>
-              <w:t>81.4756%</w:t>
+              <w:t>85.00%</w:t>
             </w:r>
           </w:p>
         </w:tc>
@@ -6467,7 +6484,7 @@
                 <w:color w:val="1F2D3D"/>
                 <w:sz w:val="16"/>
               </w:rPr>
-              <w:t>68.2927%</w:t>
+              <w:t>75.00%</w:t>
             </w:r>
           </w:p>
         </w:tc>
@@ -6496,7 +6513,128 @@
                 <w:color w:val="1F2D3D"/>
                 <w:sz w:val="16"/>
               </w:rPr>
-              <w:t>Baseline gate with maximum drop 0.005</w:t>
+              <w:t>Bundle minimum enforced during verify; current run passed</w:t>
+            </w:r>
+          </w:p>
+        </w:tc>
+      </w:tr>
+      <w:tr>
+        <w:trPr>
+          <w:cantSplit/>
+        </w:trPr>
+        <w:tc>
+          <w:tcPr>
+            <w:tcW w:type="dxa" w:w="2600"/>
+            <w:shd w:fill="F5F8FB" w:val="clear"/>
+            <w:vAlign w:val="center"/>
+            <w:tcMar>
+              <w:top w:w="80" w:type="dxa"/>
+              <w:start w:w="120" w:type="dxa"/>
+              <w:bottom w:w="80" w:type="dxa"/>
+              <w:end w:w="120" w:type="dxa"/>
+            </w:tcMar>
+          </w:tcPr>
+          <w:p>
+            <w:pPr>
+              <w:spacing w:before="0" w:after="0" w:line="254" w:lineRule="auto"/>
+              <w:jc w:val="left"/>
+            </w:pPr>
+            <w:r/>
+            <w:r>
+              <w:rPr>
+                <w:rFonts w:ascii="Arial" w:hAnsi="Arial" w:eastAsia="Arial" w:cs="Arial"/>
+                <w:b w:val="0"/>
+                <w:color w:val="1F2D3D"/>
+                <w:sz w:val="16"/>
+              </w:rPr>
+              <w:t>Regression reference</w:t>
+            </w:r>
+          </w:p>
+        </w:tc>
+        <w:tc>
+          <w:tcPr>
+            <w:tcW w:type="dxa" w:w="1300"/>
+            <w:shd w:fill="F5F8FB" w:val="clear"/>
+            <w:vAlign w:val="center"/>
+            <w:tcMar>
+              <w:top w:w="80" w:type="dxa"/>
+              <w:start w:w="120" w:type="dxa"/>
+              <w:bottom w:w="80" w:type="dxa"/>
+              <w:end w:w="120" w:type="dxa"/>
+            </w:tcMar>
+          </w:tcPr>
+          <w:p>
+            <w:pPr>
+              <w:spacing w:before="0" w:after="0" w:line="254" w:lineRule="auto"/>
+              <w:jc w:val="center"/>
+            </w:pPr>
+            <w:r/>
+            <w:r>
+              <w:rPr>
+                <w:rFonts w:ascii="Arial" w:hAnsi="Arial" w:eastAsia="Arial" w:cs="Arial"/>
+                <w:b w:val="0"/>
+                <w:color w:val="1F2D3D"/>
+                <w:sz w:val="16"/>
+              </w:rPr>
+              <w:t>81.4756%</w:t>
+            </w:r>
+          </w:p>
+        </w:tc>
+        <w:tc>
+          <w:tcPr>
+            <w:tcW w:type="dxa" w:w="1300"/>
+            <w:shd w:fill="F5F8FB" w:val="clear"/>
+            <w:vAlign w:val="center"/>
+            <w:tcMar>
+              <w:top w:w="80" w:type="dxa"/>
+              <w:start w:w="120" w:type="dxa"/>
+              <w:bottom w:w="80" w:type="dxa"/>
+              <w:end w:w="120" w:type="dxa"/>
+            </w:tcMar>
+          </w:tcPr>
+          <w:p>
+            <w:pPr>
+              <w:spacing w:before="0" w:after="0" w:line="254" w:lineRule="auto"/>
+              <w:jc w:val="center"/>
+            </w:pPr>
+            <w:r/>
+            <w:r>
+              <w:rPr>
+                <w:rFonts w:ascii="Arial" w:hAnsi="Arial" w:eastAsia="Arial" w:cs="Arial"/>
+                <w:b w:val="0"/>
+                <w:color w:val="1F2D3D"/>
+                <w:sz w:val="16"/>
+              </w:rPr>
+              <w:t>68.2927%</w:t>
+            </w:r>
+          </w:p>
+        </w:tc>
+        <w:tc>
+          <w:tcPr>
+            <w:tcW w:type="dxa" w:w="4160"/>
+            <w:shd w:fill="F5F8FB" w:val="clear"/>
+            <w:vAlign w:val="center"/>
+            <w:tcMar>
+              <w:top w:w="80" w:type="dxa"/>
+              <w:start w:w="120" w:type="dxa"/>
+              <w:bottom w:w="80" w:type="dxa"/>
+              <w:end w:w="120" w:type="dxa"/>
+            </w:tcMar>
+          </w:tcPr>
+          <w:p>
+            <w:pPr>
+              <w:spacing w:before="0" w:after="0" w:line="254" w:lineRule="auto"/>
+              <w:jc w:val="left"/>
+            </w:pPr>
+            <w:r/>
+            <w:r>
+              <w:rPr>
+                <w:rFonts w:ascii="Arial" w:hAnsi="Arial" w:eastAsia="Arial" w:cs="Arial"/>
+                <w:b w:val="0"/>
+                <w:color w:val="1F2D3D"/>
+                <w:sz w:val="16"/>
+              </w:rPr>
+              <w:t>Secondary baseline; maximum absolute drop 0.005</w:t>
             </w:r>
           </w:p>
         </w:tc>
@@ -7910,7 +8048,7 @@
                 <w:color w:val="1F2D3D"/>
                 <w:sz w:val="15"/>
               </w:rPr>
-              <w:t>pom.xml; target reports from clean rerun</w:t>
+              <w:t>pom.xml; verification/phase8/*; clean rerun</w:t>
             </w:r>
           </w:p>
         </w:tc>
@@ -7939,7 +8077,7 @@
                 <w:color w:val="1F2D3D"/>
                 <w:sz w:val="15"/>
               </w:rPr>
-              <w:t>146 tests; 89.54% instruction; 73.63% branch</w:t>
+              <w:t>172 tests; 92.55% instruction; 82.75% branch</w:t>
             </w:r>
           </w:p>
         </w:tc>
@@ -8844,7 +8982,7 @@
         <w:color w:val="6B7C8F"/>
         <w:sz w:val="17"/>
       </w:rPr>
-      <w:t>RAVAN CHUANG  ·  VERIFIED 2026-08-10  ·  MAIN 67d2cf9</w:t>
+      <w:t>RAVAN CHUANG  ·  VERIFIED 2026-08-10  ·  MAIN ff5e527</w:t>
     </w:r>
   </w:p>
 </w:ftr>

</xml_diff>